<commit_message>
Mengumpulkan tugas pekan 03
</commit_message>
<xml_diff>
--- a/Pekan-03/707012500042_Mochammad Eyckies Bintang Satryaz_Laprak3.docx
+++ b/Pekan-03/707012500042_Mochammad Eyckies Bintang Satryaz_Laprak3.docx
@@ -123,7 +123,7 @@
           <w:noProof/>
         </w:rPr>
         <w:drawing>
-          <wp:inline distT="0" distB="0" distL="0" distR="0" wp14:anchorId="16A3C472" wp14:editId="73EDFDB6">
+          <wp:inline distT="0" distB="0" distL="0" distR="0" wp14:anchorId="16A3C472" wp14:editId="209D5B6C">
             <wp:extent cx="2676525" cy="3048000"/>
             <wp:effectExtent l="0" t="0" r="0" b="0"/>
             <wp:docPr id="1938492422" name="Picture 10"/>
@@ -6008,17 +6008,2765 @@
       <w:pPr>
         <w:jc w:val="both"/>
         <w:rPr>
+          <w:noProof/>
+        </w:rPr>
+      </w:pPr>
+    </w:p>
+    <w:p>
+      <w:pPr>
+        <w:pStyle w:val="ListParagraph"/>
+        <w:numPr>
+          <w:ilvl w:val="0"/>
+          <w:numId w:val="14"/>
+        </w:numPr>
+        <w:jc w:val="both"/>
+        <w:rPr>
           <w:rFonts w:asciiTheme="majorHAnsi" w:hAnsiTheme="majorHAnsi"/>
           <w:b/>
           <w:bCs/>
         </w:rPr>
       </w:pPr>
-      <w:r>
+      <w:proofErr w:type="spellStart"/>
+      <w:r>
+        <w:rPr>
+          <w:rFonts w:asciiTheme="majorHAnsi" w:hAnsiTheme="majorHAnsi"/>
+        </w:rPr>
+        <w:t>Php</w:t>
+      </w:r>
+      <w:proofErr w:type="spellEnd"/>
+      <w:r>
+        <w:rPr>
+          <w:rFonts w:asciiTheme="majorHAnsi" w:hAnsiTheme="majorHAnsi"/>
+        </w:rPr>
+        <w:t xml:space="preserve"> </w:t>
+      </w:r>
+      <w:proofErr w:type="spellStart"/>
+      <w:r>
+        <w:rPr>
+          <w:rFonts w:asciiTheme="majorHAnsi" w:hAnsiTheme="majorHAnsi"/>
+        </w:rPr>
+        <w:t>Formunir</w:t>
+      </w:r>
+      <w:proofErr w:type="spellEnd"/>
+    </w:p>
+    <w:p>
+      <w:pPr>
+        <w:shd w:val="clear" w:color="auto" w:fill="150713"/>
+        <w:spacing w:after="0" w:line="285" w:lineRule="atLeast"/>
+        <w:rPr>
+          <w:rFonts w:ascii="Consolas" w:eastAsia="Times New Roman" w:hAnsi="Consolas" w:cs="Times New Roman"/>
+          <w:color w:val="F8F8F2"/>
+          <w:kern w:val="0"/>
+          <w:sz w:val="21"/>
+          <w:szCs w:val="21"/>
+          <w:lang w:eastAsia="en-ID"/>
+          <w14:ligatures w14:val="none"/>
+        </w:rPr>
+      </w:pPr>
+      <w:r>
+        <w:rPr>
+          <w:rFonts w:ascii="Consolas" w:eastAsia="Times New Roman" w:hAnsi="Consolas" w:cs="Times New Roman"/>
+          <w:color w:val="F8F8F2"/>
+          <w:kern w:val="0"/>
+          <w:sz w:val="21"/>
+          <w:szCs w:val="21"/>
+          <w:lang w:eastAsia="en-ID"/>
+          <w14:ligatures w14:val="none"/>
+        </w:rPr>
+        <w:t>        &lt;</w:t>
+      </w:r>
+      <w:r>
+        <w:rPr>
+          <w:rFonts w:ascii="Consolas" w:eastAsia="Times New Roman" w:hAnsi="Consolas" w:cs="Times New Roman"/>
+          <w:color w:val="8D82EA"/>
+          <w:kern w:val="0"/>
+          <w:sz w:val="21"/>
+          <w:szCs w:val="21"/>
+          <w:lang w:eastAsia="en-ID"/>
+          <w14:ligatures w14:val="none"/>
+        </w:rPr>
+        <w:t>h2</w:t>
+      </w:r>
+      <w:r>
+        <w:rPr>
+          <w:rFonts w:ascii="Consolas" w:eastAsia="Times New Roman" w:hAnsi="Consolas" w:cs="Times New Roman"/>
+          <w:color w:val="F8F8F2"/>
+          <w:kern w:val="0"/>
+          <w:sz w:val="21"/>
+          <w:szCs w:val="21"/>
+          <w:lang w:eastAsia="en-ID"/>
+          <w14:ligatures w14:val="none"/>
+        </w:rPr>
+        <w:t xml:space="preserve"> </w:t>
+      </w:r>
+      <w:r>
+        <w:rPr>
+          <w:rFonts w:ascii="Consolas" w:eastAsia="Times New Roman" w:hAnsi="Consolas" w:cs="Times New Roman"/>
+          <w:i/>
+          <w:iCs/>
+          <w:color w:val="EFA2DA"/>
+          <w:kern w:val="0"/>
+          <w:sz w:val="21"/>
+          <w:szCs w:val="21"/>
+          <w:lang w:eastAsia="en-ID"/>
+          <w14:ligatures w14:val="none"/>
+        </w:rPr>
+        <w:t>class</w:t>
+      </w:r>
+      <w:r>
+        <w:rPr>
+          <w:rFonts w:ascii="Consolas" w:eastAsia="Times New Roman" w:hAnsi="Consolas" w:cs="Times New Roman"/>
+          <w:color w:val="F8F8F2"/>
+          <w:kern w:val="0"/>
+          <w:sz w:val="21"/>
+          <w:szCs w:val="21"/>
+          <w:lang w:eastAsia="en-ID"/>
+          <w14:ligatures w14:val="none"/>
+        </w:rPr>
+        <w:t>=</w:t>
+      </w:r>
+      <w:r>
+        <w:rPr>
+          <w:rFonts w:ascii="Consolas" w:eastAsia="Times New Roman" w:hAnsi="Consolas" w:cs="Times New Roman"/>
+          <w:color w:val="F6E3CC"/>
+          <w:kern w:val="0"/>
+          <w:sz w:val="21"/>
+          <w:szCs w:val="21"/>
+          <w:lang w:eastAsia="en-ID"/>
+          <w14:ligatures w14:val="none"/>
+        </w:rPr>
+        <w:t>"section-title"</w:t>
+      </w:r>
+      <w:r>
+        <w:rPr>
+          <w:rFonts w:ascii="Consolas" w:eastAsia="Times New Roman" w:hAnsi="Consolas" w:cs="Times New Roman"/>
+          <w:color w:val="F8F8F2"/>
+          <w:kern w:val="0"/>
+          <w:sz w:val="21"/>
+          <w:szCs w:val="21"/>
+          <w:lang w:eastAsia="en-ID"/>
+          <w14:ligatures w14:val="none"/>
+        </w:rPr>
+        <w:t>&gt;&lt;</w:t>
+      </w:r>
+      <w:proofErr w:type="spellStart"/>
+      <w:r>
+        <w:rPr>
+          <w:rFonts w:ascii="Consolas" w:eastAsia="Times New Roman" w:hAnsi="Consolas" w:cs="Times New Roman"/>
+          <w:color w:val="8D82EA"/>
+          <w:kern w:val="0"/>
+          <w:sz w:val="21"/>
+          <w:szCs w:val="21"/>
+          <w:lang w:eastAsia="en-ID"/>
+          <w14:ligatures w14:val="none"/>
+        </w:rPr>
+        <w:t>i</w:t>
+      </w:r>
+      <w:proofErr w:type="spellEnd"/>
+      <w:r>
+        <w:rPr>
+          <w:rFonts w:ascii="Consolas" w:eastAsia="Times New Roman" w:hAnsi="Consolas" w:cs="Times New Roman"/>
+          <w:color w:val="F8F8F2"/>
+          <w:kern w:val="0"/>
+          <w:sz w:val="21"/>
+          <w:szCs w:val="21"/>
+          <w:lang w:eastAsia="en-ID"/>
+          <w14:ligatures w14:val="none"/>
+        </w:rPr>
+        <w:t xml:space="preserve"> </w:t>
+      </w:r>
+      <w:r>
+        <w:rPr>
+          <w:rFonts w:ascii="Consolas" w:eastAsia="Times New Roman" w:hAnsi="Consolas" w:cs="Times New Roman"/>
+          <w:i/>
+          <w:iCs/>
+          <w:color w:val="EFA2DA"/>
+          <w:kern w:val="0"/>
+          <w:sz w:val="21"/>
+          <w:szCs w:val="21"/>
+          <w:lang w:eastAsia="en-ID"/>
+          <w14:ligatures w14:val="none"/>
+        </w:rPr>
+        <w:t>class</w:t>
+      </w:r>
+      <w:r>
+        <w:rPr>
+          <w:rFonts w:ascii="Consolas" w:eastAsia="Times New Roman" w:hAnsi="Consolas" w:cs="Times New Roman"/>
+          <w:color w:val="F8F8F2"/>
+          <w:kern w:val="0"/>
+          <w:sz w:val="21"/>
+          <w:szCs w:val="21"/>
+          <w:lang w:eastAsia="en-ID"/>
+          <w14:ligatures w14:val="none"/>
+        </w:rPr>
+        <w:t>=</w:t>
+      </w:r>
+      <w:r>
+        <w:rPr>
+          <w:rFonts w:ascii="Consolas" w:eastAsia="Times New Roman" w:hAnsi="Consolas" w:cs="Times New Roman"/>
+          <w:color w:val="F6E3CC"/>
+          <w:kern w:val="0"/>
+          <w:sz w:val="21"/>
+          <w:szCs w:val="21"/>
+          <w:lang w:eastAsia="en-ID"/>
+          <w14:ligatures w14:val="none"/>
+        </w:rPr>
+        <w:t>"</w:t>
+      </w:r>
+      <w:proofErr w:type="spellStart"/>
+      <w:r>
+        <w:rPr>
+          <w:rFonts w:ascii="Consolas" w:eastAsia="Times New Roman" w:hAnsi="Consolas" w:cs="Times New Roman"/>
+          <w:color w:val="F6E3CC"/>
+          <w:kern w:val="0"/>
+          <w:sz w:val="21"/>
+          <w:szCs w:val="21"/>
+          <w:lang w:eastAsia="en-ID"/>
+          <w14:ligatures w14:val="none"/>
+        </w:rPr>
+        <w:t>fas</w:t>
+      </w:r>
+      <w:proofErr w:type="spellEnd"/>
+      <w:r>
+        <w:rPr>
+          <w:rFonts w:ascii="Consolas" w:eastAsia="Times New Roman" w:hAnsi="Consolas" w:cs="Times New Roman"/>
+          <w:color w:val="F6E3CC"/>
+          <w:kern w:val="0"/>
+          <w:sz w:val="21"/>
+          <w:szCs w:val="21"/>
+          <w:lang w:eastAsia="en-ID"/>
+          <w14:ligatures w14:val="none"/>
+        </w:rPr>
+        <w:t xml:space="preserve"> fa-table"</w:t>
+      </w:r>
+      <w:r>
+        <w:rPr>
+          <w:rFonts w:ascii="Consolas" w:eastAsia="Times New Roman" w:hAnsi="Consolas" w:cs="Times New Roman"/>
+          <w:color w:val="F8F8F2"/>
+          <w:kern w:val="0"/>
+          <w:sz w:val="21"/>
+          <w:szCs w:val="21"/>
+          <w:lang w:eastAsia="en-ID"/>
+          <w14:ligatures w14:val="none"/>
+        </w:rPr>
+        <w:t>&gt;&lt;/</w:t>
+      </w:r>
+      <w:proofErr w:type="spellStart"/>
+      <w:r>
+        <w:rPr>
+          <w:rFonts w:ascii="Consolas" w:eastAsia="Times New Roman" w:hAnsi="Consolas" w:cs="Times New Roman"/>
+          <w:color w:val="8D82EA"/>
+          <w:kern w:val="0"/>
+          <w:sz w:val="21"/>
+          <w:szCs w:val="21"/>
+          <w:lang w:eastAsia="en-ID"/>
+          <w14:ligatures w14:val="none"/>
+        </w:rPr>
+        <w:t>i</w:t>
+      </w:r>
+      <w:proofErr w:type="spellEnd"/>
+      <w:r>
+        <w:rPr>
+          <w:rFonts w:ascii="Consolas" w:eastAsia="Times New Roman" w:hAnsi="Consolas" w:cs="Times New Roman"/>
+          <w:color w:val="F8F8F2"/>
+          <w:kern w:val="0"/>
+          <w:sz w:val="21"/>
+          <w:szCs w:val="21"/>
+          <w:lang w:eastAsia="en-ID"/>
+          <w14:ligatures w14:val="none"/>
+        </w:rPr>
+        <w:t xml:space="preserve">&gt; Jadwal </w:t>
+      </w:r>
+      <w:proofErr w:type="spellStart"/>
+      <w:r>
+        <w:rPr>
+          <w:rFonts w:ascii="Consolas" w:eastAsia="Times New Roman" w:hAnsi="Consolas" w:cs="Times New Roman"/>
+          <w:color w:val="F8F8F2"/>
+          <w:kern w:val="0"/>
+          <w:sz w:val="21"/>
+          <w:szCs w:val="21"/>
+          <w:lang w:eastAsia="en-ID"/>
+          <w14:ligatures w14:val="none"/>
+        </w:rPr>
+        <w:t>Aktivitas</w:t>
+      </w:r>
+      <w:proofErr w:type="spellEnd"/>
+      <w:r>
+        <w:rPr>
+          <w:rFonts w:ascii="Consolas" w:eastAsia="Times New Roman" w:hAnsi="Consolas" w:cs="Times New Roman"/>
+          <w:color w:val="F8F8F2"/>
+          <w:kern w:val="0"/>
+          <w:sz w:val="21"/>
+          <w:szCs w:val="21"/>
+          <w:lang w:eastAsia="en-ID"/>
+          <w14:ligatures w14:val="none"/>
+        </w:rPr>
+        <w:t xml:space="preserve"> </w:t>
+      </w:r>
+      <w:proofErr w:type="spellStart"/>
+      <w:r>
+        <w:rPr>
+          <w:rFonts w:ascii="Consolas" w:eastAsia="Times New Roman" w:hAnsi="Consolas" w:cs="Times New Roman"/>
+          <w:color w:val="F8F8F2"/>
+          <w:kern w:val="0"/>
+          <w:sz w:val="21"/>
+          <w:szCs w:val="21"/>
+          <w:lang w:eastAsia="en-ID"/>
+          <w14:ligatures w14:val="none"/>
+        </w:rPr>
+        <w:t>Budaya</w:t>
+      </w:r>
+      <w:proofErr w:type="spellEnd"/>
+      <w:r>
+        <w:rPr>
+          <w:rFonts w:ascii="Consolas" w:eastAsia="Times New Roman" w:hAnsi="Consolas" w:cs="Times New Roman"/>
+          <w:color w:val="F8F8F2"/>
+          <w:kern w:val="0"/>
+          <w:sz w:val="21"/>
+          <w:szCs w:val="21"/>
+          <w:lang w:eastAsia="en-ID"/>
+          <w14:ligatures w14:val="none"/>
+        </w:rPr>
+        <w:t xml:space="preserve"> </w:t>
+      </w:r>
+      <w:proofErr w:type="spellStart"/>
+      <w:r>
+        <w:rPr>
+          <w:rFonts w:ascii="Consolas" w:eastAsia="Times New Roman" w:hAnsi="Consolas" w:cs="Times New Roman"/>
+          <w:color w:val="F8F8F2"/>
+          <w:kern w:val="0"/>
+          <w:sz w:val="21"/>
+          <w:szCs w:val="21"/>
+          <w:lang w:eastAsia="en-ID"/>
+          <w14:ligatures w14:val="none"/>
+        </w:rPr>
+        <w:t>Mingguan</w:t>
+      </w:r>
+      <w:proofErr w:type="spellEnd"/>
+      <w:r>
+        <w:rPr>
+          <w:rFonts w:ascii="Consolas" w:eastAsia="Times New Roman" w:hAnsi="Consolas" w:cs="Times New Roman"/>
+          <w:color w:val="F8F8F2"/>
+          <w:kern w:val="0"/>
+          <w:sz w:val="21"/>
+          <w:szCs w:val="21"/>
+          <w:lang w:eastAsia="en-ID"/>
+          <w14:ligatures w14:val="none"/>
+        </w:rPr>
+        <w:t>&lt;/</w:t>
+      </w:r>
+      <w:r>
+        <w:rPr>
+          <w:rFonts w:ascii="Consolas" w:eastAsia="Times New Roman" w:hAnsi="Consolas" w:cs="Times New Roman"/>
+          <w:color w:val="8D82EA"/>
+          <w:kern w:val="0"/>
+          <w:sz w:val="21"/>
+          <w:szCs w:val="21"/>
+          <w:lang w:eastAsia="en-ID"/>
+          <w14:ligatures w14:val="none"/>
+        </w:rPr>
+        <w:t>h2</w:t>
+      </w:r>
+      <w:r>
+        <w:rPr>
+          <w:rFonts w:ascii="Consolas" w:eastAsia="Times New Roman" w:hAnsi="Consolas" w:cs="Times New Roman"/>
+          <w:color w:val="F8F8F2"/>
+          <w:kern w:val="0"/>
+          <w:sz w:val="21"/>
+          <w:szCs w:val="21"/>
+          <w:lang w:eastAsia="en-ID"/>
+          <w14:ligatures w14:val="none"/>
+        </w:rPr>
+        <w:t>&gt;</w:t>
+      </w:r>
+    </w:p>
+    <w:p>
+      <w:pPr>
+        <w:shd w:val="clear" w:color="auto" w:fill="150713"/>
+        <w:spacing w:after="0" w:line="285" w:lineRule="atLeast"/>
+        <w:rPr>
+          <w:rFonts w:ascii="Consolas" w:eastAsia="Times New Roman" w:hAnsi="Consolas" w:cs="Times New Roman"/>
+          <w:color w:val="F8F8F2"/>
+          <w:kern w:val="0"/>
+          <w:sz w:val="21"/>
+          <w:szCs w:val="21"/>
+          <w:lang w:eastAsia="en-ID"/>
+          <w14:ligatures w14:val="none"/>
+        </w:rPr>
+      </w:pPr>
+    </w:p>
+    <w:p>
+      <w:pPr>
+        <w:shd w:val="clear" w:color="auto" w:fill="150713"/>
+        <w:spacing w:after="0" w:line="285" w:lineRule="atLeast"/>
+        <w:rPr>
+          <w:rFonts w:ascii="Consolas" w:eastAsia="Times New Roman" w:hAnsi="Consolas" w:cs="Times New Roman"/>
+          <w:color w:val="F8F8F2"/>
+          <w:kern w:val="0"/>
+          <w:sz w:val="21"/>
+          <w:szCs w:val="21"/>
+          <w:lang w:eastAsia="en-ID"/>
+          <w14:ligatures w14:val="none"/>
+        </w:rPr>
+      </w:pPr>
+      <w:r>
+        <w:rPr>
+          <w:rFonts w:ascii="Consolas" w:eastAsia="Times New Roman" w:hAnsi="Consolas" w:cs="Times New Roman"/>
+          <w:color w:val="F8F8F2"/>
+          <w:kern w:val="0"/>
+          <w:sz w:val="21"/>
+          <w:szCs w:val="21"/>
+          <w:lang w:eastAsia="en-ID"/>
+          <w14:ligatures w14:val="none"/>
+        </w:rPr>
+        <w:t>        &lt;</w:t>
+      </w:r>
+      <w:r>
+        <w:rPr>
+          <w:rFonts w:ascii="Consolas" w:eastAsia="Times New Roman" w:hAnsi="Consolas" w:cs="Times New Roman"/>
+          <w:color w:val="8D82EA"/>
+          <w:kern w:val="0"/>
+          <w:sz w:val="21"/>
+          <w:szCs w:val="21"/>
+          <w:lang w:eastAsia="en-ID"/>
+          <w14:ligatures w14:val="none"/>
+        </w:rPr>
+        <w:t>div</w:t>
+      </w:r>
+      <w:r>
+        <w:rPr>
+          <w:rFonts w:ascii="Consolas" w:eastAsia="Times New Roman" w:hAnsi="Consolas" w:cs="Times New Roman"/>
+          <w:color w:val="F8F8F2"/>
+          <w:kern w:val="0"/>
+          <w:sz w:val="21"/>
+          <w:szCs w:val="21"/>
+          <w:lang w:eastAsia="en-ID"/>
+          <w14:ligatures w14:val="none"/>
+        </w:rPr>
+        <w:t xml:space="preserve"> </w:t>
+      </w:r>
+      <w:r>
+        <w:rPr>
+          <w:rFonts w:ascii="Consolas" w:eastAsia="Times New Roman" w:hAnsi="Consolas" w:cs="Times New Roman"/>
+          <w:i/>
+          <w:iCs/>
+          <w:color w:val="EFA2DA"/>
+          <w:kern w:val="0"/>
+          <w:sz w:val="21"/>
+          <w:szCs w:val="21"/>
+          <w:lang w:eastAsia="en-ID"/>
+          <w14:ligatures w14:val="none"/>
+        </w:rPr>
+        <w:t>class</w:t>
+      </w:r>
+      <w:r>
+        <w:rPr>
+          <w:rFonts w:ascii="Consolas" w:eastAsia="Times New Roman" w:hAnsi="Consolas" w:cs="Times New Roman"/>
+          <w:color w:val="F8F8F2"/>
+          <w:kern w:val="0"/>
+          <w:sz w:val="21"/>
+          <w:szCs w:val="21"/>
+          <w:lang w:eastAsia="en-ID"/>
+          <w14:ligatures w14:val="none"/>
+        </w:rPr>
+        <w:t>=</w:t>
+      </w:r>
+      <w:r>
+        <w:rPr>
+          <w:rFonts w:ascii="Consolas" w:eastAsia="Times New Roman" w:hAnsi="Consolas" w:cs="Times New Roman"/>
+          <w:color w:val="F6E3CC"/>
+          <w:kern w:val="0"/>
+          <w:sz w:val="21"/>
+          <w:szCs w:val="21"/>
+          <w:lang w:eastAsia="en-ID"/>
+          <w14:ligatures w14:val="none"/>
+        </w:rPr>
+        <w:t>"schedule-table-container"</w:t>
+      </w:r>
+      <w:r>
+        <w:rPr>
+          <w:rFonts w:ascii="Consolas" w:eastAsia="Times New Roman" w:hAnsi="Consolas" w:cs="Times New Roman"/>
+          <w:color w:val="F8F8F2"/>
+          <w:kern w:val="0"/>
+          <w:sz w:val="21"/>
+          <w:szCs w:val="21"/>
+          <w:lang w:eastAsia="en-ID"/>
+          <w14:ligatures w14:val="none"/>
+        </w:rPr>
+        <w:t>&gt;</w:t>
+      </w:r>
+    </w:p>
+    <w:p>
+      <w:pPr>
+        <w:shd w:val="clear" w:color="auto" w:fill="150713"/>
+        <w:spacing w:after="0" w:line="285" w:lineRule="atLeast"/>
+        <w:rPr>
+          <w:rFonts w:ascii="Consolas" w:eastAsia="Times New Roman" w:hAnsi="Consolas" w:cs="Times New Roman"/>
+          <w:color w:val="F8F8F2"/>
+          <w:kern w:val="0"/>
+          <w:sz w:val="21"/>
+          <w:szCs w:val="21"/>
+          <w:lang w:eastAsia="en-ID"/>
+          <w14:ligatures w14:val="none"/>
+        </w:rPr>
+      </w:pPr>
+      <w:r>
+        <w:rPr>
+          <w:rFonts w:ascii="Consolas" w:eastAsia="Times New Roman" w:hAnsi="Consolas" w:cs="Times New Roman"/>
+          <w:color w:val="F8F8F2"/>
+          <w:kern w:val="0"/>
+          <w:sz w:val="21"/>
+          <w:szCs w:val="21"/>
+          <w:lang w:eastAsia="en-ID"/>
+          <w14:ligatures w14:val="none"/>
+        </w:rPr>
+        <w:t>            &lt;</w:t>
+      </w:r>
+      <w:r>
+        <w:rPr>
+          <w:rFonts w:ascii="Consolas" w:eastAsia="Times New Roman" w:hAnsi="Consolas" w:cs="Times New Roman"/>
+          <w:color w:val="8D82EA"/>
+          <w:kern w:val="0"/>
+          <w:sz w:val="21"/>
+          <w:szCs w:val="21"/>
+          <w:lang w:eastAsia="en-ID"/>
+          <w14:ligatures w14:val="none"/>
+        </w:rPr>
+        <w:t>table</w:t>
+      </w:r>
+      <w:r>
+        <w:rPr>
+          <w:rFonts w:ascii="Consolas" w:eastAsia="Times New Roman" w:hAnsi="Consolas" w:cs="Times New Roman"/>
+          <w:color w:val="F8F8F2"/>
+          <w:kern w:val="0"/>
+          <w:sz w:val="21"/>
+          <w:szCs w:val="21"/>
+          <w:lang w:eastAsia="en-ID"/>
+          <w14:ligatures w14:val="none"/>
+        </w:rPr>
+        <w:t xml:space="preserve"> </w:t>
+      </w:r>
+      <w:r>
+        <w:rPr>
+          <w:rFonts w:ascii="Consolas" w:eastAsia="Times New Roman" w:hAnsi="Consolas" w:cs="Times New Roman"/>
+          <w:i/>
+          <w:iCs/>
+          <w:color w:val="EFA2DA"/>
+          <w:kern w:val="0"/>
+          <w:sz w:val="21"/>
+          <w:szCs w:val="21"/>
+          <w:lang w:eastAsia="en-ID"/>
+          <w14:ligatures w14:val="none"/>
+        </w:rPr>
+        <w:t>class</w:t>
+      </w:r>
+      <w:r>
+        <w:rPr>
+          <w:rFonts w:ascii="Consolas" w:eastAsia="Times New Roman" w:hAnsi="Consolas" w:cs="Times New Roman"/>
+          <w:color w:val="F8F8F2"/>
+          <w:kern w:val="0"/>
+          <w:sz w:val="21"/>
+          <w:szCs w:val="21"/>
+          <w:lang w:eastAsia="en-ID"/>
+          <w14:ligatures w14:val="none"/>
+        </w:rPr>
+        <w:t>=</w:t>
+      </w:r>
+      <w:r>
+        <w:rPr>
+          <w:rFonts w:ascii="Consolas" w:eastAsia="Times New Roman" w:hAnsi="Consolas" w:cs="Times New Roman"/>
+          <w:color w:val="F6E3CC"/>
+          <w:kern w:val="0"/>
+          <w:sz w:val="21"/>
+          <w:szCs w:val="21"/>
+          <w:lang w:eastAsia="en-ID"/>
+          <w14:ligatures w14:val="none"/>
+        </w:rPr>
+        <w:t>"schedule-table"</w:t>
+      </w:r>
+      <w:r>
+        <w:rPr>
+          <w:rFonts w:ascii="Consolas" w:eastAsia="Times New Roman" w:hAnsi="Consolas" w:cs="Times New Roman"/>
+          <w:color w:val="F8F8F2"/>
+          <w:kern w:val="0"/>
+          <w:sz w:val="21"/>
+          <w:szCs w:val="21"/>
+          <w:lang w:eastAsia="en-ID"/>
+          <w14:ligatures w14:val="none"/>
+        </w:rPr>
+        <w:t xml:space="preserve"> </w:t>
+      </w:r>
+      <w:r>
+        <w:rPr>
+          <w:rFonts w:ascii="Consolas" w:eastAsia="Times New Roman" w:hAnsi="Consolas" w:cs="Times New Roman"/>
+          <w:i/>
+          <w:iCs/>
+          <w:color w:val="EFA2DA"/>
+          <w:kern w:val="0"/>
+          <w:sz w:val="21"/>
+          <w:szCs w:val="21"/>
+          <w:lang w:eastAsia="en-ID"/>
+          <w14:ligatures w14:val="none"/>
+        </w:rPr>
+        <w:t>id</w:t>
+      </w:r>
+      <w:r>
+        <w:rPr>
+          <w:rFonts w:ascii="Consolas" w:eastAsia="Times New Roman" w:hAnsi="Consolas" w:cs="Times New Roman"/>
+          <w:color w:val="F8F8F2"/>
+          <w:kern w:val="0"/>
+          <w:sz w:val="21"/>
+          <w:szCs w:val="21"/>
+          <w:lang w:eastAsia="en-ID"/>
+          <w14:ligatures w14:val="none"/>
+        </w:rPr>
+        <w:t>=</w:t>
+      </w:r>
+      <w:r>
+        <w:rPr>
+          <w:rFonts w:ascii="Consolas" w:eastAsia="Times New Roman" w:hAnsi="Consolas" w:cs="Times New Roman"/>
+          <w:color w:val="F6E3CC"/>
+          <w:kern w:val="0"/>
+          <w:sz w:val="21"/>
+          <w:szCs w:val="21"/>
+          <w:lang w:eastAsia="en-ID"/>
+          <w14:ligatures w14:val="none"/>
+        </w:rPr>
+        <w:t>"</w:t>
+      </w:r>
+      <w:proofErr w:type="spellStart"/>
+      <w:r>
+        <w:rPr>
+          <w:rFonts w:ascii="Consolas" w:eastAsia="Times New Roman" w:hAnsi="Consolas" w:cs="Times New Roman"/>
+          <w:color w:val="F6E3CC"/>
+          <w:kern w:val="0"/>
+          <w:sz w:val="21"/>
+          <w:szCs w:val="21"/>
+          <w:lang w:eastAsia="en-ID"/>
+          <w14:ligatures w14:val="none"/>
+        </w:rPr>
+        <w:t>mainScheduleTable</w:t>
+      </w:r>
+      <w:proofErr w:type="spellEnd"/>
+      <w:r>
+        <w:rPr>
+          <w:rFonts w:ascii="Consolas" w:eastAsia="Times New Roman" w:hAnsi="Consolas" w:cs="Times New Roman"/>
+          <w:color w:val="F6E3CC"/>
+          <w:kern w:val="0"/>
+          <w:sz w:val="21"/>
+          <w:szCs w:val="21"/>
+          <w:lang w:eastAsia="en-ID"/>
+          <w14:ligatures w14:val="none"/>
+        </w:rPr>
+        <w:t>"</w:t>
+      </w:r>
+      <w:r>
+        <w:rPr>
+          <w:rFonts w:ascii="Consolas" w:eastAsia="Times New Roman" w:hAnsi="Consolas" w:cs="Times New Roman"/>
+          <w:color w:val="F8F8F2"/>
+          <w:kern w:val="0"/>
+          <w:sz w:val="21"/>
+          <w:szCs w:val="21"/>
+          <w:lang w:eastAsia="en-ID"/>
+          <w14:ligatures w14:val="none"/>
+        </w:rPr>
+        <w:t>&gt;</w:t>
+      </w:r>
+    </w:p>
+    <w:p>
+      <w:pPr>
+        <w:shd w:val="clear" w:color="auto" w:fill="150713"/>
+        <w:spacing w:after="0" w:line="285" w:lineRule="atLeast"/>
+        <w:rPr>
+          <w:rFonts w:ascii="Consolas" w:eastAsia="Times New Roman" w:hAnsi="Consolas" w:cs="Times New Roman"/>
+          <w:color w:val="F8F8F2"/>
+          <w:kern w:val="0"/>
+          <w:sz w:val="21"/>
+          <w:szCs w:val="21"/>
+          <w:lang w:eastAsia="en-ID"/>
+          <w14:ligatures w14:val="none"/>
+        </w:rPr>
+      </w:pPr>
+      <w:r>
+        <w:rPr>
+          <w:rFonts w:ascii="Consolas" w:eastAsia="Times New Roman" w:hAnsi="Consolas" w:cs="Times New Roman"/>
+          <w:color w:val="F8F8F2"/>
+          <w:kern w:val="0"/>
+          <w:sz w:val="21"/>
+          <w:szCs w:val="21"/>
+          <w:lang w:eastAsia="en-ID"/>
+          <w14:ligatures w14:val="none"/>
+        </w:rPr>
+        <w:t>            &lt;</w:t>
+      </w:r>
+      <w:proofErr w:type="spellStart"/>
+      <w:r>
+        <w:rPr>
+          <w:rFonts w:ascii="Consolas" w:eastAsia="Times New Roman" w:hAnsi="Consolas" w:cs="Times New Roman"/>
+          <w:color w:val="8D82EA"/>
+          <w:kern w:val="0"/>
+          <w:sz w:val="21"/>
+          <w:szCs w:val="21"/>
+          <w:lang w:eastAsia="en-ID"/>
+          <w14:ligatures w14:val="none"/>
+        </w:rPr>
+        <w:t>thead</w:t>
+      </w:r>
+      <w:proofErr w:type="spellEnd"/>
+      <w:r>
+        <w:rPr>
+          <w:rFonts w:ascii="Consolas" w:eastAsia="Times New Roman" w:hAnsi="Consolas" w:cs="Times New Roman"/>
+          <w:color w:val="F8F8F2"/>
+          <w:kern w:val="0"/>
+          <w:sz w:val="21"/>
+          <w:szCs w:val="21"/>
+          <w:lang w:eastAsia="en-ID"/>
+          <w14:ligatures w14:val="none"/>
+        </w:rPr>
+        <w:t>&gt;</w:t>
+      </w:r>
+    </w:p>
+    <w:p>
+      <w:pPr>
+        <w:shd w:val="clear" w:color="auto" w:fill="150713"/>
+        <w:spacing w:after="0" w:line="285" w:lineRule="atLeast"/>
+        <w:rPr>
+          <w:rFonts w:ascii="Consolas" w:eastAsia="Times New Roman" w:hAnsi="Consolas" w:cs="Times New Roman"/>
+          <w:color w:val="F8F8F2"/>
+          <w:kern w:val="0"/>
+          <w:sz w:val="21"/>
+          <w:szCs w:val="21"/>
+          <w:lang w:eastAsia="en-ID"/>
+          <w14:ligatures w14:val="none"/>
+        </w:rPr>
+      </w:pPr>
+      <w:r>
+        <w:rPr>
+          <w:rFonts w:ascii="Consolas" w:eastAsia="Times New Roman" w:hAnsi="Consolas" w:cs="Times New Roman"/>
+          <w:color w:val="F8F8F2"/>
+          <w:kern w:val="0"/>
+          <w:sz w:val="21"/>
+          <w:szCs w:val="21"/>
+          <w:lang w:eastAsia="en-ID"/>
+          <w14:ligatures w14:val="none"/>
+        </w:rPr>
+        <w:t>                &lt;</w:t>
+      </w:r>
+      <w:r>
+        <w:rPr>
+          <w:rFonts w:ascii="Consolas" w:eastAsia="Times New Roman" w:hAnsi="Consolas" w:cs="Times New Roman"/>
+          <w:color w:val="8D82EA"/>
+          <w:kern w:val="0"/>
+          <w:sz w:val="21"/>
+          <w:szCs w:val="21"/>
+          <w:lang w:eastAsia="en-ID"/>
+          <w14:ligatures w14:val="none"/>
+        </w:rPr>
+        <w:t>tr</w:t>
+      </w:r>
+      <w:r>
+        <w:rPr>
+          <w:rFonts w:ascii="Consolas" w:eastAsia="Times New Roman" w:hAnsi="Consolas" w:cs="Times New Roman"/>
+          <w:color w:val="F8F8F2"/>
+          <w:kern w:val="0"/>
+          <w:sz w:val="21"/>
+          <w:szCs w:val="21"/>
+          <w:lang w:eastAsia="en-ID"/>
+          <w14:ligatures w14:val="none"/>
+        </w:rPr>
+        <w:t>&gt;</w:t>
+      </w:r>
+    </w:p>
+    <w:p>
+      <w:pPr>
+        <w:shd w:val="clear" w:color="auto" w:fill="150713"/>
+        <w:spacing w:after="0" w:line="285" w:lineRule="atLeast"/>
+        <w:rPr>
+          <w:rFonts w:ascii="Consolas" w:eastAsia="Times New Roman" w:hAnsi="Consolas" w:cs="Times New Roman"/>
+          <w:color w:val="F8F8F2"/>
+          <w:kern w:val="0"/>
+          <w:sz w:val="21"/>
+          <w:szCs w:val="21"/>
+          <w:lang w:eastAsia="en-ID"/>
+          <w14:ligatures w14:val="none"/>
+        </w:rPr>
+      </w:pPr>
+      <w:r>
+        <w:rPr>
+          <w:rFonts w:ascii="Consolas" w:eastAsia="Times New Roman" w:hAnsi="Consolas" w:cs="Times New Roman"/>
+          <w:color w:val="F8F8F2"/>
+          <w:kern w:val="0"/>
+          <w:sz w:val="21"/>
+          <w:szCs w:val="21"/>
+          <w:lang w:eastAsia="en-ID"/>
+          <w14:ligatures w14:val="none"/>
+        </w:rPr>
+        <w:t>                    &lt;</w:t>
+      </w:r>
+      <w:proofErr w:type="spellStart"/>
+      <w:r>
+        <w:rPr>
+          <w:rFonts w:ascii="Consolas" w:eastAsia="Times New Roman" w:hAnsi="Consolas" w:cs="Times New Roman"/>
+          <w:color w:val="8D82EA"/>
+          <w:kern w:val="0"/>
+          <w:sz w:val="21"/>
+          <w:szCs w:val="21"/>
+          <w:lang w:eastAsia="en-ID"/>
+          <w14:ligatures w14:val="none"/>
+        </w:rPr>
+        <w:t>th</w:t>
+      </w:r>
+      <w:proofErr w:type="spellEnd"/>
+      <w:r>
+        <w:rPr>
+          <w:rFonts w:ascii="Consolas" w:eastAsia="Times New Roman" w:hAnsi="Consolas" w:cs="Times New Roman"/>
+          <w:color w:val="F8F8F2"/>
+          <w:kern w:val="0"/>
+          <w:sz w:val="21"/>
+          <w:szCs w:val="21"/>
+          <w:lang w:eastAsia="en-ID"/>
+          <w14:ligatures w14:val="none"/>
+        </w:rPr>
+        <w:t>&gt;Waktu&lt;/</w:t>
+      </w:r>
+      <w:proofErr w:type="spellStart"/>
+      <w:r>
+        <w:rPr>
+          <w:rFonts w:ascii="Consolas" w:eastAsia="Times New Roman" w:hAnsi="Consolas" w:cs="Times New Roman"/>
+          <w:color w:val="8D82EA"/>
+          <w:kern w:val="0"/>
+          <w:sz w:val="21"/>
+          <w:szCs w:val="21"/>
+          <w:lang w:eastAsia="en-ID"/>
+          <w14:ligatures w14:val="none"/>
+        </w:rPr>
+        <w:t>th</w:t>
+      </w:r>
+      <w:proofErr w:type="spellEnd"/>
+      <w:r>
+        <w:rPr>
+          <w:rFonts w:ascii="Consolas" w:eastAsia="Times New Roman" w:hAnsi="Consolas" w:cs="Times New Roman"/>
+          <w:color w:val="F8F8F2"/>
+          <w:kern w:val="0"/>
+          <w:sz w:val="21"/>
+          <w:szCs w:val="21"/>
+          <w:lang w:eastAsia="en-ID"/>
+          <w14:ligatures w14:val="none"/>
+        </w:rPr>
+        <w:t>&gt;</w:t>
+      </w:r>
+    </w:p>
+    <w:p>
+      <w:pPr>
+        <w:shd w:val="clear" w:color="auto" w:fill="150713"/>
+        <w:spacing w:after="0" w:line="285" w:lineRule="atLeast"/>
+        <w:rPr>
+          <w:rFonts w:ascii="Consolas" w:eastAsia="Times New Roman" w:hAnsi="Consolas" w:cs="Times New Roman"/>
+          <w:color w:val="F8F8F2"/>
+          <w:kern w:val="0"/>
+          <w:sz w:val="21"/>
+          <w:szCs w:val="21"/>
+          <w:lang w:eastAsia="en-ID"/>
+          <w14:ligatures w14:val="none"/>
+        </w:rPr>
+      </w:pPr>
+      <w:r>
+        <w:rPr>
+          <w:rFonts w:ascii="Consolas" w:eastAsia="Times New Roman" w:hAnsi="Consolas" w:cs="Times New Roman"/>
+          <w:color w:val="F8F8F2"/>
+          <w:kern w:val="0"/>
+          <w:sz w:val="21"/>
+          <w:szCs w:val="21"/>
+          <w:lang w:eastAsia="en-ID"/>
+          <w14:ligatures w14:val="none"/>
+        </w:rPr>
+        <w:t>                    &lt;</w:t>
+      </w:r>
+      <w:proofErr w:type="spellStart"/>
+      <w:r>
+        <w:rPr>
+          <w:rFonts w:ascii="Consolas" w:eastAsia="Times New Roman" w:hAnsi="Consolas" w:cs="Times New Roman"/>
+          <w:color w:val="8D82EA"/>
+          <w:kern w:val="0"/>
+          <w:sz w:val="21"/>
+          <w:szCs w:val="21"/>
+          <w:lang w:eastAsia="en-ID"/>
+          <w14:ligatures w14:val="none"/>
+        </w:rPr>
+        <w:t>th</w:t>
+      </w:r>
+      <w:proofErr w:type="spellEnd"/>
+      <w:r>
+        <w:rPr>
+          <w:rFonts w:ascii="Consolas" w:eastAsia="Times New Roman" w:hAnsi="Consolas" w:cs="Times New Roman"/>
+          <w:color w:val="F8F8F2"/>
+          <w:kern w:val="0"/>
+          <w:sz w:val="21"/>
+          <w:szCs w:val="21"/>
+          <w:lang w:eastAsia="en-ID"/>
+          <w14:ligatures w14:val="none"/>
+        </w:rPr>
+        <w:t xml:space="preserve">&gt;Nama </w:t>
+      </w:r>
+      <w:proofErr w:type="spellStart"/>
+      <w:r>
+        <w:rPr>
+          <w:rFonts w:ascii="Consolas" w:eastAsia="Times New Roman" w:hAnsi="Consolas" w:cs="Times New Roman"/>
+          <w:color w:val="F8F8F2"/>
+          <w:kern w:val="0"/>
+          <w:sz w:val="21"/>
+          <w:szCs w:val="21"/>
+          <w:lang w:eastAsia="en-ID"/>
+          <w14:ligatures w14:val="none"/>
+        </w:rPr>
+        <w:t>Aktivitas</w:t>
+      </w:r>
+      <w:proofErr w:type="spellEnd"/>
+      <w:r>
+        <w:rPr>
+          <w:rFonts w:ascii="Consolas" w:eastAsia="Times New Roman" w:hAnsi="Consolas" w:cs="Times New Roman"/>
+          <w:color w:val="F8F8F2"/>
+          <w:kern w:val="0"/>
+          <w:sz w:val="21"/>
+          <w:szCs w:val="21"/>
+          <w:lang w:eastAsia="en-ID"/>
+          <w14:ligatures w14:val="none"/>
+        </w:rPr>
+        <w:t>&lt;/</w:t>
+      </w:r>
+      <w:proofErr w:type="spellStart"/>
+      <w:r>
+        <w:rPr>
+          <w:rFonts w:ascii="Consolas" w:eastAsia="Times New Roman" w:hAnsi="Consolas" w:cs="Times New Roman"/>
+          <w:color w:val="8D82EA"/>
+          <w:kern w:val="0"/>
+          <w:sz w:val="21"/>
+          <w:szCs w:val="21"/>
+          <w:lang w:eastAsia="en-ID"/>
+          <w14:ligatures w14:val="none"/>
+        </w:rPr>
+        <w:t>th</w:t>
+      </w:r>
+      <w:proofErr w:type="spellEnd"/>
+      <w:r>
+        <w:rPr>
+          <w:rFonts w:ascii="Consolas" w:eastAsia="Times New Roman" w:hAnsi="Consolas" w:cs="Times New Roman"/>
+          <w:color w:val="F8F8F2"/>
+          <w:kern w:val="0"/>
+          <w:sz w:val="21"/>
+          <w:szCs w:val="21"/>
+          <w:lang w:eastAsia="en-ID"/>
+          <w14:ligatures w14:val="none"/>
+        </w:rPr>
+        <w:t>&gt;</w:t>
+      </w:r>
+    </w:p>
+    <w:p>
+      <w:pPr>
+        <w:shd w:val="clear" w:color="auto" w:fill="150713"/>
+        <w:spacing w:after="0" w:line="285" w:lineRule="atLeast"/>
+        <w:rPr>
+          <w:rFonts w:ascii="Consolas" w:eastAsia="Times New Roman" w:hAnsi="Consolas" w:cs="Times New Roman"/>
+          <w:color w:val="F8F8F2"/>
+          <w:kern w:val="0"/>
+          <w:sz w:val="21"/>
+          <w:szCs w:val="21"/>
+          <w:lang w:eastAsia="en-ID"/>
+          <w14:ligatures w14:val="none"/>
+        </w:rPr>
+      </w:pPr>
+      <w:r>
+        <w:rPr>
+          <w:rFonts w:ascii="Consolas" w:eastAsia="Times New Roman" w:hAnsi="Consolas" w:cs="Times New Roman"/>
+          <w:color w:val="F8F8F2"/>
+          <w:kern w:val="0"/>
+          <w:sz w:val="21"/>
+          <w:szCs w:val="21"/>
+          <w:lang w:eastAsia="en-ID"/>
+          <w14:ligatures w14:val="none"/>
+        </w:rPr>
+        <w:t>                    &lt;</w:t>
+      </w:r>
+      <w:proofErr w:type="spellStart"/>
+      <w:r>
+        <w:rPr>
+          <w:rFonts w:ascii="Consolas" w:eastAsia="Times New Roman" w:hAnsi="Consolas" w:cs="Times New Roman"/>
+          <w:color w:val="8D82EA"/>
+          <w:kern w:val="0"/>
+          <w:sz w:val="21"/>
+          <w:szCs w:val="21"/>
+          <w:lang w:eastAsia="en-ID"/>
+          <w14:ligatures w14:val="none"/>
+        </w:rPr>
+        <w:t>th</w:t>
+      </w:r>
+      <w:proofErr w:type="spellEnd"/>
+      <w:r>
+        <w:rPr>
+          <w:rFonts w:ascii="Consolas" w:eastAsia="Times New Roman" w:hAnsi="Consolas" w:cs="Times New Roman"/>
+          <w:color w:val="F8F8F2"/>
+          <w:kern w:val="0"/>
+          <w:sz w:val="21"/>
+          <w:szCs w:val="21"/>
+          <w:lang w:eastAsia="en-ID"/>
+          <w14:ligatures w14:val="none"/>
+        </w:rPr>
+        <w:t>&gt;Jenis&lt;/</w:t>
+      </w:r>
+      <w:proofErr w:type="spellStart"/>
+      <w:r>
+        <w:rPr>
+          <w:rFonts w:ascii="Consolas" w:eastAsia="Times New Roman" w:hAnsi="Consolas" w:cs="Times New Roman"/>
+          <w:color w:val="8D82EA"/>
+          <w:kern w:val="0"/>
+          <w:sz w:val="21"/>
+          <w:szCs w:val="21"/>
+          <w:lang w:eastAsia="en-ID"/>
+          <w14:ligatures w14:val="none"/>
+        </w:rPr>
+        <w:t>th</w:t>
+      </w:r>
+      <w:proofErr w:type="spellEnd"/>
+      <w:r>
+        <w:rPr>
+          <w:rFonts w:ascii="Consolas" w:eastAsia="Times New Roman" w:hAnsi="Consolas" w:cs="Times New Roman"/>
+          <w:color w:val="F8F8F2"/>
+          <w:kern w:val="0"/>
+          <w:sz w:val="21"/>
+          <w:szCs w:val="21"/>
+          <w:lang w:eastAsia="en-ID"/>
+          <w14:ligatures w14:val="none"/>
+        </w:rPr>
+        <w:t>&gt;</w:t>
+      </w:r>
+    </w:p>
+    <w:p>
+      <w:pPr>
+        <w:shd w:val="clear" w:color="auto" w:fill="150713"/>
+        <w:spacing w:after="0" w:line="285" w:lineRule="atLeast"/>
+        <w:rPr>
+          <w:rFonts w:ascii="Consolas" w:eastAsia="Times New Roman" w:hAnsi="Consolas" w:cs="Times New Roman"/>
+          <w:color w:val="F8F8F2"/>
+          <w:kern w:val="0"/>
+          <w:sz w:val="21"/>
+          <w:szCs w:val="21"/>
+          <w:lang w:eastAsia="en-ID"/>
+          <w14:ligatures w14:val="none"/>
+        </w:rPr>
+      </w:pPr>
+      <w:r>
+        <w:rPr>
+          <w:rFonts w:ascii="Consolas" w:eastAsia="Times New Roman" w:hAnsi="Consolas" w:cs="Times New Roman"/>
+          <w:color w:val="F8F8F2"/>
+          <w:kern w:val="0"/>
+          <w:sz w:val="21"/>
+          <w:szCs w:val="21"/>
+          <w:lang w:eastAsia="en-ID"/>
+          <w14:ligatures w14:val="none"/>
+        </w:rPr>
+        <w:t>                    &lt;</w:t>
+      </w:r>
+      <w:proofErr w:type="spellStart"/>
+      <w:r>
+        <w:rPr>
+          <w:rFonts w:ascii="Consolas" w:eastAsia="Times New Roman" w:hAnsi="Consolas" w:cs="Times New Roman"/>
+          <w:color w:val="8D82EA"/>
+          <w:kern w:val="0"/>
+          <w:sz w:val="21"/>
+          <w:szCs w:val="21"/>
+          <w:lang w:eastAsia="en-ID"/>
+          <w14:ligatures w14:val="none"/>
+        </w:rPr>
+        <w:t>th</w:t>
+      </w:r>
+      <w:proofErr w:type="spellEnd"/>
+      <w:r>
+        <w:rPr>
+          <w:rFonts w:ascii="Consolas" w:eastAsia="Times New Roman" w:hAnsi="Consolas" w:cs="Times New Roman"/>
+          <w:color w:val="F8F8F2"/>
+          <w:kern w:val="0"/>
+          <w:sz w:val="21"/>
+          <w:szCs w:val="21"/>
+          <w:lang w:eastAsia="en-ID"/>
+          <w14:ligatures w14:val="none"/>
+        </w:rPr>
+        <w:t>&gt;Lokasi&lt;/</w:t>
+      </w:r>
+      <w:proofErr w:type="spellStart"/>
+      <w:r>
+        <w:rPr>
+          <w:rFonts w:ascii="Consolas" w:eastAsia="Times New Roman" w:hAnsi="Consolas" w:cs="Times New Roman"/>
+          <w:color w:val="8D82EA"/>
+          <w:kern w:val="0"/>
+          <w:sz w:val="21"/>
+          <w:szCs w:val="21"/>
+          <w:lang w:eastAsia="en-ID"/>
+          <w14:ligatures w14:val="none"/>
+        </w:rPr>
+        <w:t>th</w:t>
+      </w:r>
+      <w:proofErr w:type="spellEnd"/>
+      <w:r>
+        <w:rPr>
+          <w:rFonts w:ascii="Consolas" w:eastAsia="Times New Roman" w:hAnsi="Consolas" w:cs="Times New Roman"/>
+          <w:color w:val="F8F8F2"/>
+          <w:kern w:val="0"/>
+          <w:sz w:val="21"/>
+          <w:szCs w:val="21"/>
+          <w:lang w:eastAsia="en-ID"/>
+          <w14:ligatures w14:val="none"/>
+        </w:rPr>
+        <w:t>&gt;</w:t>
+      </w:r>
+    </w:p>
+    <w:p>
+      <w:pPr>
+        <w:shd w:val="clear" w:color="auto" w:fill="150713"/>
+        <w:spacing w:after="0" w:line="285" w:lineRule="atLeast"/>
+        <w:rPr>
+          <w:rFonts w:ascii="Consolas" w:eastAsia="Times New Roman" w:hAnsi="Consolas" w:cs="Times New Roman"/>
+          <w:color w:val="F8F8F2"/>
+          <w:kern w:val="0"/>
+          <w:sz w:val="21"/>
+          <w:szCs w:val="21"/>
+          <w:lang w:eastAsia="en-ID"/>
+          <w14:ligatures w14:val="none"/>
+        </w:rPr>
+      </w:pPr>
+      <w:r>
+        <w:rPr>
+          <w:rFonts w:ascii="Consolas" w:eastAsia="Times New Roman" w:hAnsi="Consolas" w:cs="Times New Roman"/>
+          <w:color w:val="F8F8F2"/>
+          <w:kern w:val="0"/>
+          <w:sz w:val="21"/>
+          <w:szCs w:val="21"/>
+          <w:lang w:eastAsia="en-ID"/>
+          <w14:ligatures w14:val="none"/>
+        </w:rPr>
+        <w:t>                    &lt;</w:t>
+      </w:r>
+      <w:proofErr w:type="spellStart"/>
+      <w:r>
+        <w:rPr>
+          <w:rFonts w:ascii="Consolas" w:eastAsia="Times New Roman" w:hAnsi="Consolas" w:cs="Times New Roman"/>
+          <w:color w:val="8D82EA"/>
+          <w:kern w:val="0"/>
+          <w:sz w:val="21"/>
+          <w:szCs w:val="21"/>
+          <w:lang w:eastAsia="en-ID"/>
+          <w14:ligatures w14:val="none"/>
+        </w:rPr>
+        <w:t>th</w:t>
+      </w:r>
+      <w:proofErr w:type="spellEnd"/>
+      <w:r>
+        <w:rPr>
+          <w:rFonts w:ascii="Consolas" w:eastAsia="Times New Roman" w:hAnsi="Consolas" w:cs="Times New Roman"/>
+          <w:color w:val="F8F8F2"/>
+          <w:kern w:val="0"/>
+          <w:sz w:val="21"/>
+          <w:szCs w:val="21"/>
+          <w:lang w:eastAsia="en-ID"/>
+          <w14:ligatures w14:val="none"/>
+        </w:rPr>
+        <w:t>&gt;Detail&lt;/</w:t>
+      </w:r>
+      <w:proofErr w:type="spellStart"/>
+      <w:r>
+        <w:rPr>
+          <w:rFonts w:ascii="Consolas" w:eastAsia="Times New Roman" w:hAnsi="Consolas" w:cs="Times New Roman"/>
+          <w:color w:val="8D82EA"/>
+          <w:kern w:val="0"/>
+          <w:sz w:val="21"/>
+          <w:szCs w:val="21"/>
+          <w:lang w:eastAsia="en-ID"/>
+          <w14:ligatures w14:val="none"/>
+        </w:rPr>
+        <w:t>th</w:t>
+      </w:r>
+      <w:proofErr w:type="spellEnd"/>
+      <w:r>
+        <w:rPr>
+          <w:rFonts w:ascii="Consolas" w:eastAsia="Times New Roman" w:hAnsi="Consolas" w:cs="Times New Roman"/>
+          <w:color w:val="F8F8F2"/>
+          <w:kern w:val="0"/>
+          <w:sz w:val="21"/>
+          <w:szCs w:val="21"/>
+          <w:lang w:eastAsia="en-ID"/>
+          <w14:ligatures w14:val="none"/>
+        </w:rPr>
+        <w:t>&gt;</w:t>
+      </w:r>
+    </w:p>
+    <w:p>
+      <w:pPr>
+        <w:shd w:val="clear" w:color="auto" w:fill="150713"/>
+        <w:spacing w:after="0" w:line="285" w:lineRule="atLeast"/>
+        <w:rPr>
+          <w:rFonts w:ascii="Consolas" w:eastAsia="Times New Roman" w:hAnsi="Consolas" w:cs="Times New Roman"/>
+          <w:color w:val="F8F8F2"/>
+          <w:kern w:val="0"/>
+          <w:sz w:val="21"/>
+          <w:szCs w:val="21"/>
+          <w:lang w:eastAsia="en-ID"/>
+          <w14:ligatures w14:val="none"/>
+        </w:rPr>
+      </w:pPr>
+      <w:r>
+        <w:rPr>
+          <w:rFonts w:ascii="Consolas" w:eastAsia="Times New Roman" w:hAnsi="Consolas" w:cs="Times New Roman"/>
+          <w:color w:val="F8F8F2"/>
+          <w:kern w:val="0"/>
+          <w:sz w:val="21"/>
+          <w:szCs w:val="21"/>
+          <w:lang w:eastAsia="en-ID"/>
+          <w14:ligatures w14:val="none"/>
+        </w:rPr>
+        <w:t>                &lt;/</w:t>
+      </w:r>
+      <w:r>
+        <w:rPr>
+          <w:rFonts w:ascii="Consolas" w:eastAsia="Times New Roman" w:hAnsi="Consolas" w:cs="Times New Roman"/>
+          <w:color w:val="8D82EA"/>
+          <w:kern w:val="0"/>
+          <w:sz w:val="21"/>
+          <w:szCs w:val="21"/>
+          <w:lang w:eastAsia="en-ID"/>
+          <w14:ligatures w14:val="none"/>
+        </w:rPr>
+        <w:t>tr</w:t>
+      </w:r>
+      <w:r>
+        <w:rPr>
+          <w:rFonts w:ascii="Consolas" w:eastAsia="Times New Roman" w:hAnsi="Consolas" w:cs="Times New Roman"/>
+          <w:color w:val="F8F8F2"/>
+          <w:kern w:val="0"/>
+          <w:sz w:val="21"/>
+          <w:szCs w:val="21"/>
+          <w:lang w:eastAsia="en-ID"/>
+          <w14:ligatures w14:val="none"/>
+        </w:rPr>
+        <w:t>&gt;</w:t>
+      </w:r>
+    </w:p>
+    <w:p>
+      <w:pPr>
+        <w:shd w:val="clear" w:color="auto" w:fill="150713"/>
+        <w:spacing w:after="0" w:line="285" w:lineRule="atLeast"/>
+        <w:rPr>
+          <w:rFonts w:ascii="Consolas" w:eastAsia="Times New Roman" w:hAnsi="Consolas" w:cs="Times New Roman"/>
+          <w:color w:val="F8F8F2"/>
+          <w:kern w:val="0"/>
+          <w:sz w:val="21"/>
+          <w:szCs w:val="21"/>
+          <w:lang w:eastAsia="en-ID"/>
+          <w14:ligatures w14:val="none"/>
+        </w:rPr>
+      </w:pPr>
+      <w:r>
+        <w:rPr>
+          <w:rFonts w:ascii="Consolas" w:eastAsia="Times New Roman" w:hAnsi="Consolas" w:cs="Times New Roman"/>
+          <w:color w:val="F8F8F2"/>
+          <w:kern w:val="0"/>
+          <w:sz w:val="21"/>
+          <w:szCs w:val="21"/>
+          <w:lang w:eastAsia="en-ID"/>
+          <w14:ligatures w14:val="none"/>
+        </w:rPr>
+        <w:t>            &lt;/</w:t>
+      </w:r>
+      <w:proofErr w:type="spellStart"/>
+      <w:r>
+        <w:rPr>
+          <w:rFonts w:ascii="Consolas" w:eastAsia="Times New Roman" w:hAnsi="Consolas" w:cs="Times New Roman"/>
+          <w:color w:val="8D82EA"/>
+          <w:kern w:val="0"/>
+          <w:sz w:val="21"/>
+          <w:szCs w:val="21"/>
+          <w:lang w:eastAsia="en-ID"/>
+          <w14:ligatures w14:val="none"/>
+        </w:rPr>
+        <w:t>thead</w:t>
+      </w:r>
+      <w:proofErr w:type="spellEnd"/>
+      <w:r>
+        <w:rPr>
+          <w:rFonts w:ascii="Consolas" w:eastAsia="Times New Roman" w:hAnsi="Consolas" w:cs="Times New Roman"/>
+          <w:color w:val="F8F8F2"/>
+          <w:kern w:val="0"/>
+          <w:sz w:val="21"/>
+          <w:szCs w:val="21"/>
+          <w:lang w:eastAsia="en-ID"/>
+          <w14:ligatures w14:val="none"/>
+        </w:rPr>
+        <w:t>&gt;</w:t>
+      </w:r>
+    </w:p>
+    <w:p>
+      <w:pPr>
+        <w:shd w:val="clear" w:color="auto" w:fill="150713"/>
+        <w:spacing w:after="0" w:line="285" w:lineRule="atLeast"/>
+        <w:rPr>
+          <w:rFonts w:ascii="Consolas" w:eastAsia="Times New Roman" w:hAnsi="Consolas" w:cs="Times New Roman"/>
+          <w:color w:val="F8F8F2"/>
+          <w:kern w:val="0"/>
+          <w:sz w:val="21"/>
+          <w:szCs w:val="21"/>
+          <w:lang w:eastAsia="en-ID"/>
+          <w14:ligatures w14:val="none"/>
+        </w:rPr>
+      </w:pPr>
+      <w:r>
+        <w:rPr>
+          <w:rFonts w:ascii="Consolas" w:eastAsia="Times New Roman" w:hAnsi="Consolas" w:cs="Times New Roman"/>
+          <w:color w:val="F8F8F2"/>
+          <w:kern w:val="0"/>
+          <w:sz w:val="21"/>
+          <w:szCs w:val="21"/>
+          <w:lang w:eastAsia="en-ID"/>
+          <w14:ligatures w14:val="none"/>
+        </w:rPr>
+        <w:t>            &lt;</w:t>
+      </w:r>
+      <w:proofErr w:type="spellStart"/>
+      <w:r>
+        <w:rPr>
+          <w:rFonts w:ascii="Consolas" w:eastAsia="Times New Roman" w:hAnsi="Consolas" w:cs="Times New Roman"/>
+          <w:color w:val="8D82EA"/>
+          <w:kern w:val="0"/>
+          <w:sz w:val="21"/>
+          <w:szCs w:val="21"/>
+          <w:lang w:eastAsia="en-ID"/>
+          <w14:ligatures w14:val="none"/>
+        </w:rPr>
+        <w:t>tbody</w:t>
+      </w:r>
+      <w:proofErr w:type="spellEnd"/>
+      <w:r>
+        <w:rPr>
+          <w:rFonts w:ascii="Consolas" w:eastAsia="Times New Roman" w:hAnsi="Consolas" w:cs="Times New Roman"/>
+          <w:color w:val="F8F8F2"/>
+          <w:kern w:val="0"/>
+          <w:sz w:val="21"/>
+          <w:szCs w:val="21"/>
+          <w:lang w:eastAsia="en-ID"/>
+          <w14:ligatures w14:val="none"/>
+        </w:rPr>
+        <w:t>&gt;</w:t>
+      </w:r>
+    </w:p>
+    <w:p>
+      <w:pPr>
+        <w:shd w:val="clear" w:color="auto" w:fill="150713"/>
+        <w:spacing w:after="0" w:line="285" w:lineRule="atLeast"/>
+        <w:rPr>
+          <w:rFonts w:ascii="Consolas" w:eastAsia="Times New Roman" w:hAnsi="Consolas" w:cs="Times New Roman"/>
+          <w:color w:val="F8F8F2"/>
+          <w:kern w:val="0"/>
+          <w:sz w:val="21"/>
+          <w:szCs w:val="21"/>
+          <w:lang w:eastAsia="en-ID"/>
+          <w14:ligatures w14:val="none"/>
+        </w:rPr>
+      </w:pPr>
+      <w:r>
+        <w:rPr>
+          <w:rFonts w:ascii="Consolas" w:eastAsia="Times New Roman" w:hAnsi="Consolas" w:cs="Times New Roman"/>
+          <w:color w:val="F8F8F2"/>
+          <w:kern w:val="0"/>
+          <w:sz w:val="21"/>
+          <w:szCs w:val="21"/>
+          <w:lang w:eastAsia="en-ID"/>
+          <w14:ligatures w14:val="none"/>
+        </w:rPr>
+        <w:t>                &lt;?</w:t>
+      </w:r>
+      <w:proofErr w:type="spellStart"/>
+      <w:r>
+        <w:rPr>
+          <w:rFonts w:ascii="Consolas" w:eastAsia="Times New Roman" w:hAnsi="Consolas" w:cs="Times New Roman"/>
+          <w:color w:val="F8F8F2"/>
+          <w:kern w:val="0"/>
+          <w:sz w:val="21"/>
+          <w:szCs w:val="21"/>
+          <w:lang w:eastAsia="en-ID"/>
+          <w14:ligatures w14:val="none"/>
+        </w:rPr>
+        <w:t>php</w:t>
+      </w:r>
+      <w:proofErr w:type="spellEnd"/>
+    </w:p>
+    <w:p>
+      <w:pPr>
+        <w:shd w:val="clear" w:color="auto" w:fill="150713"/>
+        <w:spacing w:after="0" w:line="285" w:lineRule="atLeast"/>
+        <w:rPr>
+          <w:rFonts w:ascii="Consolas" w:eastAsia="Times New Roman" w:hAnsi="Consolas" w:cs="Times New Roman"/>
+          <w:color w:val="F8F8F2"/>
+          <w:kern w:val="0"/>
+          <w:sz w:val="21"/>
+          <w:szCs w:val="21"/>
+          <w:lang w:eastAsia="en-ID"/>
+          <w14:ligatures w14:val="none"/>
+        </w:rPr>
+      </w:pPr>
+      <w:r>
+        <w:rPr>
+          <w:rFonts w:ascii="Consolas" w:eastAsia="Times New Roman" w:hAnsi="Consolas" w:cs="Times New Roman"/>
+          <w:color w:val="F8F8F2"/>
+          <w:kern w:val="0"/>
+          <w:sz w:val="21"/>
+          <w:szCs w:val="21"/>
+          <w:lang w:eastAsia="en-ID"/>
+          <w14:ligatures w14:val="none"/>
+        </w:rPr>
+        <w:t xml:space="preserve">                </w:t>
+      </w:r>
+      <w:r>
+        <w:rPr>
+          <w:rFonts w:ascii="Consolas" w:eastAsia="Times New Roman" w:hAnsi="Consolas" w:cs="Times New Roman"/>
+          <w:color w:val="E0474B"/>
+          <w:kern w:val="0"/>
+          <w:sz w:val="21"/>
+          <w:szCs w:val="21"/>
+          <w:lang w:eastAsia="en-ID"/>
+          <w14:ligatures w14:val="none"/>
+        </w:rPr>
+        <w:t>if</w:t>
+      </w:r>
+      <w:r>
+        <w:rPr>
+          <w:rFonts w:ascii="Consolas" w:eastAsia="Times New Roman" w:hAnsi="Consolas" w:cs="Times New Roman"/>
+          <w:color w:val="F8F8F2"/>
+          <w:kern w:val="0"/>
+          <w:sz w:val="21"/>
+          <w:szCs w:val="21"/>
+          <w:lang w:eastAsia="en-ID"/>
+          <w14:ligatures w14:val="none"/>
+        </w:rPr>
+        <w:t>(</w:t>
+      </w:r>
+      <w:proofErr w:type="spellStart"/>
+      <w:r>
+        <w:rPr>
+          <w:rFonts w:ascii="Consolas" w:eastAsia="Times New Roman" w:hAnsi="Consolas" w:cs="Times New Roman"/>
+          <w:color w:val="EFA2DA"/>
+          <w:kern w:val="0"/>
+          <w:sz w:val="21"/>
+          <w:szCs w:val="21"/>
+          <w:lang w:eastAsia="en-ID"/>
+          <w14:ligatures w14:val="none"/>
+        </w:rPr>
+        <w:t>isset</w:t>
+      </w:r>
+      <w:proofErr w:type="spellEnd"/>
+      <w:r>
+        <w:rPr>
+          <w:rFonts w:ascii="Consolas" w:eastAsia="Times New Roman" w:hAnsi="Consolas" w:cs="Times New Roman"/>
+          <w:color w:val="EFA2DA"/>
+          <w:kern w:val="0"/>
+          <w:sz w:val="21"/>
+          <w:szCs w:val="21"/>
+          <w:lang w:eastAsia="en-ID"/>
+          <w14:ligatures w14:val="none"/>
+        </w:rPr>
+        <w:t>($_POST[</w:t>
+      </w:r>
+      <w:r>
+        <w:rPr>
+          <w:rFonts w:ascii="Consolas" w:eastAsia="Times New Roman" w:hAnsi="Consolas" w:cs="Times New Roman"/>
+          <w:color w:val="F6E3CC"/>
+          <w:kern w:val="0"/>
+          <w:sz w:val="21"/>
+          <w:szCs w:val="21"/>
+          <w:lang w:eastAsia="en-ID"/>
+          <w14:ligatures w14:val="none"/>
+        </w:rPr>
+        <w:t>"</w:t>
+      </w:r>
+      <w:proofErr w:type="spellStart"/>
+      <w:r>
+        <w:rPr>
+          <w:rFonts w:ascii="Consolas" w:eastAsia="Times New Roman" w:hAnsi="Consolas" w:cs="Times New Roman"/>
+          <w:color w:val="F6E3CC"/>
+          <w:kern w:val="0"/>
+          <w:sz w:val="21"/>
+          <w:szCs w:val="21"/>
+          <w:lang w:eastAsia="en-ID"/>
+          <w14:ligatures w14:val="none"/>
+        </w:rPr>
+        <w:t>NamaEvent</w:t>
+      </w:r>
+      <w:proofErr w:type="spellEnd"/>
+      <w:r>
+        <w:rPr>
+          <w:rFonts w:ascii="Consolas" w:eastAsia="Times New Roman" w:hAnsi="Consolas" w:cs="Times New Roman"/>
+          <w:color w:val="F6E3CC"/>
+          <w:kern w:val="0"/>
+          <w:sz w:val="21"/>
+          <w:szCs w:val="21"/>
+          <w:lang w:eastAsia="en-ID"/>
+          <w14:ligatures w14:val="none"/>
+        </w:rPr>
+        <w:t>"</w:t>
+      </w:r>
+      <w:r>
+        <w:rPr>
+          <w:rFonts w:ascii="Consolas" w:eastAsia="Times New Roman" w:hAnsi="Consolas" w:cs="Times New Roman"/>
+          <w:color w:val="EFA2DA"/>
+          <w:kern w:val="0"/>
+          <w:sz w:val="21"/>
+          <w:szCs w:val="21"/>
+          <w:lang w:eastAsia="en-ID"/>
+          <w14:ligatures w14:val="none"/>
+        </w:rPr>
+        <w:t>]</w:t>
+      </w:r>
+      <w:proofErr w:type="gramStart"/>
+      <w:r>
+        <w:rPr>
+          <w:rFonts w:ascii="Consolas" w:eastAsia="Times New Roman" w:hAnsi="Consolas" w:cs="Times New Roman"/>
+          <w:color w:val="EFA2DA"/>
+          <w:kern w:val="0"/>
+          <w:sz w:val="21"/>
+          <w:szCs w:val="21"/>
+          <w:lang w:eastAsia="en-ID"/>
+          <w14:ligatures w14:val="none"/>
+        </w:rPr>
+        <w:t>)</w:t>
+      </w:r>
+      <w:r>
+        <w:rPr>
+          <w:rFonts w:ascii="Consolas" w:eastAsia="Times New Roman" w:hAnsi="Consolas" w:cs="Times New Roman"/>
+          <w:color w:val="F8F8F2"/>
+          <w:kern w:val="0"/>
+          <w:sz w:val="21"/>
+          <w:szCs w:val="21"/>
+          <w:lang w:eastAsia="en-ID"/>
+          <w14:ligatures w14:val="none"/>
+        </w:rPr>
+        <w:t>){</w:t>
+      </w:r>
+      <w:proofErr w:type="gramEnd"/>
+    </w:p>
+    <w:p>
+      <w:pPr>
+        <w:shd w:val="clear" w:color="auto" w:fill="150713"/>
+        <w:spacing w:after="0" w:line="285" w:lineRule="atLeast"/>
+        <w:rPr>
+          <w:rFonts w:ascii="Consolas" w:eastAsia="Times New Roman" w:hAnsi="Consolas" w:cs="Times New Roman"/>
+          <w:color w:val="F8F8F2"/>
+          <w:kern w:val="0"/>
+          <w:sz w:val="21"/>
+          <w:szCs w:val="21"/>
+          <w:lang w:eastAsia="en-ID"/>
+          <w14:ligatures w14:val="none"/>
+        </w:rPr>
+      </w:pPr>
+      <w:r>
+        <w:rPr>
+          <w:rFonts w:ascii="Consolas" w:eastAsia="Times New Roman" w:hAnsi="Consolas" w:cs="Times New Roman"/>
+          <w:color w:val="F8F8F2"/>
+          <w:kern w:val="0"/>
+          <w:sz w:val="21"/>
+          <w:szCs w:val="21"/>
+          <w:lang w:eastAsia="en-ID"/>
+          <w14:ligatures w14:val="none"/>
+        </w:rPr>
+        <w:t>                    $</w:t>
+      </w:r>
+      <w:proofErr w:type="spellStart"/>
+      <w:r>
+        <w:rPr>
+          <w:rFonts w:ascii="Consolas" w:eastAsia="Times New Roman" w:hAnsi="Consolas" w:cs="Times New Roman"/>
+          <w:color w:val="F8F8F2"/>
+          <w:kern w:val="0"/>
+          <w:sz w:val="21"/>
+          <w:szCs w:val="21"/>
+          <w:lang w:eastAsia="en-ID"/>
+          <w14:ligatures w14:val="none"/>
+        </w:rPr>
+        <w:t>tgl</w:t>
+      </w:r>
+      <w:proofErr w:type="spellEnd"/>
+      <w:r>
+        <w:rPr>
+          <w:rFonts w:ascii="Consolas" w:eastAsia="Times New Roman" w:hAnsi="Consolas" w:cs="Times New Roman"/>
+          <w:color w:val="F8F8F2"/>
+          <w:kern w:val="0"/>
+          <w:sz w:val="21"/>
+          <w:szCs w:val="21"/>
+          <w:lang w:eastAsia="en-ID"/>
+          <w14:ligatures w14:val="none"/>
+        </w:rPr>
+        <w:t xml:space="preserve"> </w:t>
+      </w:r>
+      <w:r>
+        <w:rPr>
+          <w:rFonts w:ascii="Consolas" w:eastAsia="Times New Roman" w:hAnsi="Consolas" w:cs="Times New Roman"/>
+          <w:color w:val="8D82EA"/>
+          <w:kern w:val="0"/>
+          <w:sz w:val="21"/>
+          <w:szCs w:val="21"/>
+          <w:lang w:eastAsia="en-ID"/>
+          <w14:ligatures w14:val="none"/>
+        </w:rPr>
+        <w:t>=</w:t>
+      </w:r>
+      <w:r>
+        <w:rPr>
+          <w:rFonts w:ascii="Consolas" w:eastAsia="Times New Roman" w:hAnsi="Consolas" w:cs="Times New Roman"/>
+          <w:color w:val="F8F8F2"/>
+          <w:kern w:val="0"/>
+          <w:sz w:val="21"/>
+          <w:szCs w:val="21"/>
+          <w:lang w:eastAsia="en-ID"/>
+          <w14:ligatures w14:val="none"/>
+        </w:rPr>
+        <w:t xml:space="preserve"> </w:t>
+      </w:r>
+      <w:proofErr w:type="gramStart"/>
+      <w:r>
+        <w:rPr>
+          <w:rFonts w:ascii="Consolas" w:eastAsia="Times New Roman" w:hAnsi="Consolas" w:cs="Times New Roman"/>
+          <w:color w:val="EFA2DA"/>
+          <w:kern w:val="0"/>
+          <w:sz w:val="21"/>
+          <w:szCs w:val="21"/>
+          <w:lang w:eastAsia="en-ID"/>
+          <w14:ligatures w14:val="none"/>
+        </w:rPr>
+        <w:t>date(</w:t>
+      </w:r>
+      <w:proofErr w:type="gramEnd"/>
+      <w:r>
+        <w:rPr>
+          <w:rFonts w:ascii="Consolas" w:eastAsia="Times New Roman" w:hAnsi="Consolas" w:cs="Times New Roman"/>
+          <w:color w:val="F6E3CC"/>
+          <w:kern w:val="0"/>
+          <w:sz w:val="21"/>
+          <w:szCs w:val="21"/>
+          <w:lang w:eastAsia="en-ID"/>
+          <w14:ligatures w14:val="none"/>
+        </w:rPr>
+        <w:t>"l, d M Y"</w:t>
+      </w:r>
+      <w:r>
+        <w:rPr>
+          <w:rFonts w:ascii="Consolas" w:eastAsia="Times New Roman" w:hAnsi="Consolas" w:cs="Times New Roman"/>
+          <w:color w:val="EFA2DA"/>
+          <w:kern w:val="0"/>
+          <w:sz w:val="21"/>
+          <w:szCs w:val="21"/>
+          <w:lang w:eastAsia="en-ID"/>
+          <w14:ligatures w14:val="none"/>
+        </w:rPr>
+        <w:t xml:space="preserve">, </w:t>
+      </w:r>
+      <w:proofErr w:type="spellStart"/>
+      <w:r>
+        <w:rPr>
+          <w:rFonts w:ascii="Consolas" w:eastAsia="Times New Roman" w:hAnsi="Consolas" w:cs="Times New Roman"/>
+          <w:color w:val="EFA2DA"/>
+          <w:kern w:val="0"/>
+          <w:sz w:val="21"/>
+          <w:szCs w:val="21"/>
+          <w:lang w:eastAsia="en-ID"/>
+          <w14:ligatures w14:val="none"/>
+        </w:rPr>
+        <w:t>strtotime</w:t>
+      </w:r>
+      <w:proofErr w:type="spellEnd"/>
+      <w:r>
+        <w:rPr>
+          <w:rFonts w:ascii="Consolas" w:eastAsia="Times New Roman" w:hAnsi="Consolas" w:cs="Times New Roman"/>
+          <w:color w:val="EFA2DA"/>
+          <w:kern w:val="0"/>
+          <w:sz w:val="21"/>
+          <w:szCs w:val="21"/>
+          <w:lang w:eastAsia="en-ID"/>
+          <w14:ligatures w14:val="none"/>
+        </w:rPr>
+        <w:t>($_POST[</w:t>
+      </w:r>
+      <w:r>
+        <w:rPr>
+          <w:rFonts w:ascii="Consolas" w:eastAsia="Times New Roman" w:hAnsi="Consolas" w:cs="Times New Roman"/>
+          <w:color w:val="F6E3CC"/>
+          <w:kern w:val="0"/>
+          <w:sz w:val="21"/>
+          <w:szCs w:val="21"/>
+          <w:lang w:eastAsia="en-ID"/>
+          <w14:ligatures w14:val="none"/>
+        </w:rPr>
+        <w:t>"</w:t>
+      </w:r>
+      <w:proofErr w:type="spellStart"/>
+      <w:r>
+        <w:rPr>
+          <w:rFonts w:ascii="Consolas" w:eastAsia="Times New Roman" w:hAnsi="Consolas" w:cs="Times New Roman"/>
+          <w:color w:val="F6E3CC"/>
+          <w:kern w:val="0"/>
+          <w:sz w:val="21"/>
+          <w:szCs w:val="21"/>
+          <w:lang w:eastAsia="en-ID"/>
+          <w14:ligatures w14:val="none"/>
+        </w:rPr>
+        <w:t>tanggal</w:t>
+      </w:r>
+      <w:proofErr w:type="spellEnd"/>
+      <w:r>
+        <w:rPr>
+          <w:rFonts w:ascii="Consolas" w:eastAsia="Times New Roman" w:hAnsi="Consolas" w:cs="Times New Roman"/>
+          <w:color w:val="F6E3CC"/>
+          <w:kern w:val="0"/>
+          <w:sz w:val="21"/>
+          <w:szCs w:val="21"/>
+          <w:lang w:eastAsia="en-ID"/>
+          <w14:ligatures w14:val="none"/>
+        </w:rPr>
+        <w:t>"</w:t>
+      </w:r>
+      <w:r>
+        <w:rPr>
+          <w:rFonts w:ascii="Consolas" w:eastAsia="Times New Roman" w:hAnsi="Consolas" w:cs="Times New Roman"/>
+          <w:color w:val="EFA2DA"/>
+          <w:kern w:val="0"/>
+          <w:sz w:val="21"/>
+          <w:szCs w:val="21"/>
+          <w:lang w:eastAsia="en-ID"/>
+          <w14:ligatures w14:val="none"/>
+        </w:rPr>
+        <w:t>]))</w:t>
+      </w:r>
+      <w:r>
+        <w:rPr>
+          <w:rFonts w:ascii="Consolas" w:eastAsia="Times New Roman" w:hAnsi="Consolas" w:cs="Times New Roman"/>
+          <w:color w:val="F8F8F2"/>
+          <w:kern w:val="0"/>
+          <w:sz w:val="21"/>
+          <w:szCs w:val="21"/>
+          <w:lang w:eastAsia="en-ID"/>
+          <w14:ligatures w14:val="none"/>
+        </w:rPr>
+        <w:t>;</w:t>
+      </w:r>
+    </w:p>
+    <w:p>
+      <w:pPr>
+        <w:shd w:val="clear" w:color="auto" w:fill="150713"/>
+        <w:spacing w:after="0" w:line="285" w:lineRule="atLeast"/>
+        <w:rPr>
+          <w:rFonts w:ascii="Consolas" w:eastAsia="Times New Roman" w:hAnsi="Consolas" w:cs="Times New Roman"/>
+          <w:color w:val="F8F8F2"/>
+          <w:kern w:val="0"/>
+          <w:sz w:val="21"/>
+          <w:szCs w:val="21"/>
+          <w:lang w:val="sv-SE" w:eastAsia="en-ID"/>
+          <w14:ligatures w14:val="none"/>
+        </w:rPr>
+      </w:pPr>
+      <w:r>
+        <w:rPr>
+          <w:rFonts w:ascii="Consolas" w:eastAsia="Times New Roman" w:hAnsi="Consolas" w:cs="Times New Roman"/>
+          <w:color w:val="F8F8F2"/>
+          <w:kern w:val="0"/>
+          <w:sz w:val="21"/>
+          <w:szCs w:val="21"/>
+          <w:lang w:eastAsia="en-ID"/>
+          <w14:ligatures w14:val="none"/>
+        </w:rPr>
+        <w:t xml:space="preserve">                    </w:t>
+      </w:r>
+      <w:r>
+        <w:rPr>
+          <w:rFonts w:ascii="Consolas" w:eastAsia="Times New Roman" w:hAnsi="Consolas" w:cs="Times New Roman"/>
+          <w:color w:val="F8F8F2"/>
+          <w:kern w:val="0"/>
+          <w:sz w:val="21"/>
+          <w:szCs w:val="21"/>
+          <w:lang w:val="sv-SE" w:eastAsia="en-ID"/>
+          <w14:ligatures w14:val="none"/>
+        </w:rPr>
+        <w:t xml:space="preserve">$kat </w:t>
+      </w:r>
+      <w:r>
+        <w:rPr>
+          <w:rFonts w:ascii="Consolas" w:eastAsia="Times New Roman" w:hAnsi="Consolas" w:cs="Times New Roman"/>
+          <w:color w:val="8D82EA"/>
+          <w:kern w:val="0"/>
+          <w:sz w:val="21"/>
+          <w:szCs w:val="21"/>
+          <w:lang w:val="sv-SE" w:eastAsia="en-ID"/>
+          <w14:ligatures w14:val="none"/>
+        </w:rPr>
+        <w:t>=</w:t>
+      </w:r>
+      <w:r>
+        <w:rPr>
+          <w:rFonts w:ascii="Consolas" w:eastAsia="Times New Roman" w:hAnsi="Consolas" w:cs="Times New Roman"/>
+          <w:color w:val="F8F8F2"/>
+          <w:kern w:val="0"/>
+          <w:sz w:val="21"/>
+          <w:szCs w:val="21"/>
+          <w:lang w:val="sv-SE" w:eastAsia="en-ID"/>
+          <w14:ligatures w14:val="none"/>
+        </w:rPr>
+        <w:t xml:space="preserve"> </w:t>
+      </w:r>
+      <w:r>
+        <w:rPr>
+          <w:rFonts w:ascii="Consolas" w:eastAsia="Times New Roman" w:hAnsi="Consolas" w:cs="Times New Roman"/>
+          <w:color w:val="EFA2DA"/>
+          <w:kern w:val="0"/>
+          <w:sz w:val="21"/>
+          <w:szCs w:val="21"/>
+          <w:lang w:val="sv-SE" w:eastAsia="en-ID"/>
+          <w14:ligatures w14:val="none"/>
+        </w:rPr>
+        <w:t>htmlspecialchars($_POST[</w:t>
+      </w:r>
+      <w:r>
+        <w:rPr>
+          <w:rFonts w:ascii="Consolas" w:eastAsia="Times New Roman" w:hAnsi="Consolas" w:cs="Times New Roman"/>
+          <w:color w:val="F6E3CC"/>
+          <w:kern w:val="0"/>
+          <w:sz w:val="21"/>
+          <w:szCs w:val="21"/>
+          <w:lang w:val="sv-SE" w:eastAsia="en-ID"/>
+          <w14:ligatures w14:val="none"/>
+        </w:rPr>
+        <w:t>"Kategori"</w:t>
+      </w:r>
+      <w:r>
+        <w:rPr>
+          <w:rFonts w:ascii="Consolas" w:eastAsia="Times New Roman" w:hAnsi="Consolas" w:cs="Times New Roman"/>
+          <w:color w:val="EFA2DA"/>
+          <w:kern w:val="0"/>
+          <w:sz w:val="21"/>
+          <w:szCs w:val="21"/>
+          <w:lang w:val="sv-SE" w:eastAsia="en-ID"/>
+          <w14:ligatures w14:val="none"/>
+        </w:rPr>
+        <w:t>])</w:t>
+      </w:r>
+      <w:r>
+        <w:rPr>
+          <w:rFonts w:ascii="Consolas" w:eastAsia="Times New Roman" w:hAnsi="Consolas" w:cs="Times New Roman"/>
+          <w:color w:val="F8F8F2"/>
+          <w:kern w:val="0"/>
+          <w:sz w:val="21"/>
+          <w:szCs w:val="21"/>
+          <w:lang w:val="sv-SE" w:eastAsia="en-ID"/>
+          <w14:ligatures w14:val="none"/>
+        </w:rPr>
+        <w:t>;</w:t>
+      </w:r>
+    </w:p>
+    <w:p>
+      <w:pPr>
+        <w:shd w:val="clear" w:color="auto" w:fill="150713"/>
+        <w:spacing w:after="0" w:line="285" w:lineRule="atLeast"/>
+        <w:rPr>
+          <w:rFonts w:ascii="Consolas" w:eastAsia="Times New Roman" w:hAnsi="Consolas" w:cs="Times New Roman"/>
+          <w:color w:val="F8F8F2"/>
+          <w:kern w:val="0"/>
+          <w:sz w:val="21"/>
+          <w:szCs w:val="21"/>
+          <w:lang w:val="sv-SE" w:eastAsia="en-ID"/>
+          <w14:ligatures w14:val="none"/>
+        </w:rPr>
+      </w:pPr>
+      <w:r>
+        <w:rPr>
+          <w:rFonts w:ascii="Consolas" w:eastAsia="Times New Roman" w:hAnsi="Consolas" w:cs="Times New Roman"/>
+          <w:color w:val="F8F8F2"/>
+          <w:kern w:val="0"/>
+          <w:sz w:val="21"/>
+          <w:szCs w:val="21"/>
+          <w:lang w:val="sv-SE" w:eastAsia="en-ID"/>
+          <w14:ligatures w14:val="none"/>
+        </w:rPr>
+        <w:t xml:space="preserve">                    $tag </w:t>
+      </w:r>
+      <w:r>
+        <w:rPr>
+          <w:rFonts w:ascii="Consolas" w:eastAsia="Times New Roman" w:hAnsi="Consolas" w:cs="Times New Roman"/>
+          <w:color w:val="8D82EA"/>
+          <w:kern w:val="0"/>
+          <w:sz w:val="21"/>
+          <w:szCs w:val="21"/>
+          <w:lang w:val="sv-SE" w:eastAsia="en-ID"/>
+          <w14:ligatures w14:val="none"/>
+        </w:rPr>
+        <w:t>=</w:t>
+      </w:r>
+      <w:r>
+        <w:rPr>
+          <w:rFonts w:ascii="Consolas" w:eastAsia="Times New Roman" w:hAnsi="Consolas" w:cs="Times New Roman"/>
+          <w:color w:val="F8F8F2"/>
+          <w:kern w:val="0"/>
+          <w:sz w:val="21"/>
+          <w:szCs w:val="21"/>
+          <w:lang w:val="sv-SE" w:eastAsia="en-ID"/>
+          <w14:ligatures w14:val="none"/>
+        </w:rPr>
+        <w:t xml:space="preserve"> </w:t>
+      </w:r>
+      <w:r>
+        <w:rPr>
+          <w:rFonts w:ascii="Consolas" w:eastAsia="Times New Roman" w:hAnsi="Consolas" w:cs="Times New Roman"/>
+          <w:color w:val="EFA2DA"/>
+          <w:kern w:val="0"/>
+          <w:sz w:val="21"/>
+          <w:szCs w:val="21"/>
+          <w:lang w:val="sv-SE" w:eastAsia="en-ID"/>
+          <w14:ligatures w14:val="none"/>
+        </w:rPr>
+        <w:t>strtolower($kat)</w:t>
+      </w:r>
+      <w:r>
+        <w:rPr>
+          <w:rFonts w:ascii="Consolas" w:eastAsia="Times New Roman" w:hAnsi="Consolas" w:cs="Times New Roman"/>
+          <w:color w:val="F8F8F2"/>
+          <w:kern w:val="0"/>
+          <w:sz w:val="21"/>
+          <w:szCs w:val="21"/>
+          <w:lang w:val="sv-SE" w:eastAsia="en-ID"/>
+          <w14:ligatures w14:val="none"/>
+        </w:rPr>
+        <w:t>;</w:t>
+      </w:r>
+    </w:p>
+    <w:p>
+      <w:pPr>
+        <w:shd w:val="clear" w:color="auto" w:fill="150713"/>
+        <w:spacing w:after="0" w:line="285" w:lineRule="atLeast"/>
+        <w:rPr>
+          <w:rFonts w:ascii="Consolas" w:eastAsia="Times New Roman" w:hAnsi="Consolas" w:cs="Times New Roman"/>
+          <w:color w:val="F8F8F2"/>
+          <w:kern w:val="0"/>
+          <w:sz w:val="21"/>
+          <w:szCs w:val="21"/>
+          <w:lang w:eastAsia="en-ID"/>
+          <w14:ligatures w14:val="none"/>
+        </w:rPr>
+      </w:pPr>
+      <w:r>
+        <w:rPr>
+          <w:rFonts w:ascii="Consolas" w:eastAsia="Times New Roman" w:hAnsi="Consolas" w:cs="Times New Roman"/>
+          <w:color w:val="F8F8F2"/>
+          <w:kern w:val="0"/>
+          <w:sz w:val="21"/>
+          <w:szCs w:val="21"/>
+          <w:lang w:val="sv-SE" w:eastAsia="en-ID"/>
+          <w14:ligatures w14:val="none"/>
+        </w:rPr>
+        <w:t xml:space="preserve">                    </w:t>
+      </w:r>
+      <w:r>
+        <w:rPr>
+          <w:rFonts w:ascii="Consolas" w:eastAsia="Times New Roman" w:hAnsi="Consolas" w:cs="Times New Roman"/>
+          <w:color w:val="EFA2DA"/>
+          <w:kern w:val="0"/>
+          <w:sz w:val="21"/>
+          <w:szCs w:val="21"/>
+          <w:lang w:eastAsia="en-ID"/>
+          <w14:ligatures w14:val="none"/>
+        </w:rPr>
+        <w:t>echo</w:t>
+      </w:r>
+      <w:r>
+        <w:rPr>
+          <w:rFonts w:ascii="Consolas" w:eastAsia="Times New Roman" w:hAnsi="Consolas" w:cs="Times New Roman"/>
+          <w:color w:val="F8F8F2"/>
+          <w:kern w:val="0"/>
+          <w:sz w:val="21"/>
+          <w:szCs w:val="21"/>
+          <w:lang w:eastAsia="en-ID"/>
+          <w14:ligatures w14:val="none"/>
+        </w:rPr>
+        <w:t xml:space="preserve"> </w:t>
+      </w:r>
+      <w:r>
+        <w:rPr>
+          <w:rFonts w:ascii="Consolas" w:eastAsia="Times New Roman" w:hAnsi="Consolas" w:cs="Times New Roman"/>
+          <w:color w:val="F6E3CC"/>
+          <w:kern w:val="0"/>
+          <w:sz w:val="21"/>
+          <w:szCs w:val="21"/>
+          <w:lang w:eastAsia="en-ID"/>
+          <w14:ligatures w14:val="none"/>
+        </w:rPr>
+        <w:t>"&lt;tr&gt;</w:t>
+      </w:r>
+    </w:p>
+    <w:p>
+      <w:pPr>
+        <w:shd w:val="clear" w:color="auto" w:fill="150713"/>
+        <w:spacing w:after="0" w:line="285" w:lineRule="atLeast"/>
+        <w:rPr>
+          <w:rFonts w:ascii="Consolas" w:eastAsia="Times New Roman" w:hAnsi="Consolas" w:cs="Times New Roman"/>
+          <w:color w:val="F8F8F2"/>
+          <w:kern w:val="0"/>
+          <w:sz w:val="21"/>
+          <w:szCs w:val="21"/>
+          <w:lang w:eastAsia="en-ID"/>
+          <w14:ligatures w14:val="none"/>
+        </w:rPr>
+      </w:pPr>
+      <w:r>
+        <w:rPr>
+          <w:rFonts w:ascii="Consolas" w:eastAsia="Times New Roman" w:hAnsi="Consolas" w:cs="Times New Roman"/>
+          <w:color w:val="F6E3CC"/>
+          <w:kern w:val="0"/>
+          <w:sz w:val="21"/>
+          <w:szCs w:val="21"/>
+          <w:lang w:eastAsia="en-ID"/>
+          <w14:ligatures w14:val="none"/>
+        </w:rPr>
+        <w:t>                            &lt;td&gt;{$</w:t>
+      </w:r>
+      <w:proofErr w:type="spellStart"/>
+      <w:proofErr w:type="gramStart"/>
+      <w:r>
+        <w:rPr>
+          <w:rFonts w:ascii="Consolas" w:eastAsia="Times New Roman" w:hAnsi="Consolas" w:cs="Times New Roman"/>
+          <w:color w:val="F6E3CC"/>
+          <w:kern w:val="0"/>
+          <w:sz w:val="21"/>
+          <w:szCs w:val="21"/>
+          <w:lang w:eastAsia="en-ID"/>
+          <w14:ligatures w14:val="none"/>
+        </w:rPr>
+        <w:t>tgl</w:t>
+      </w:r>
+      <w:proofErr w:type="spellEnd"/>
+      <w:r>
+        <w:rPr>
+          <w:rFonts w:ascii="Consolas" w:eastAsia="Times New Roman" w:hAnsi="Consolas" w:cs="Times New Roman"/>
+          <w:color w:val="F6E3CC"/>
+          <w:kern w:val="0"/>
+          <w:sz w:val="21"/>
+          <w:szCs w:val="21"/>
+          <w:lang w:eastAsia="en-ID"/>
+          <w14:ligatures w14:val="none"/>
+        </w:rPr>
+        <w:t>}&lt;</w:t>
+      </w:r>
+      <w:proofErr w:type="gramEnd"/>
+      <w:r>
+        <w:rPr>
+          <w:rFonts w:ascii="Consolas" w:eastAsia="Times New Roman" w:hAnsi="Consolas" w:cs="Times New Roman"/>
+          <w:color w:val="F6E3CC"/>
+          <w:kern w:val="0"/>
+          <w:sz w:val="21"/>
+          <w:szCs w:val="21"/>
+          <w:lang w:eastAsia="en-ID"/>
+          <w14:ligatures w14:val="none"/>
+        </w:rPr>
+        <w:t>/td&gt;</w:t>
+      </w:r>
+    </w:p>
+    <w:p>
+      <w:pPr>
+        <w:shd w:val="clear" w:color="auto" w:fill="150713"/>
+        <w:spacing w:after="0" w:line="285" w:lineRule="atLeast"/>
+        <w:rPr>
+          <w:rFonts w:ascii="Consolas" w:eastAsia="Times New Roman" w:hAnsi="Consolas" w:cs="Times New Roman"/>
+          <w:color w:val="F8F8F2"/>
+          <w:kern w:val="0"/>
+          <w:sz w:val="21"/>
+          <w:szCs w:val="21"/>
+          <w:lang w:eastAsia="en-ID"/>
+          <w14:ligatures w14:val="none"/>
+        </w:rPr>
+      </w:pPr>
+      <w:r>
+        <w:rPr>
+          <w:rFonts w:ascii="Consolas" w:eastAsia="Times New Roman" w:hAnsi="Consolas" w:cs="Times New Roman"/>
+          <w:color w:val="F6E3CC"/>
+          <w:kern w:val="0"/>
+          <w:sz w:val="21"/>
+          <w:szCs w:val="21"/>
+          <w:lang w:eastAsia="en-ID"/>
+          <w14:ligatures w14:val="none"/>
+        </w:rPr>
+        <w:t>                            &lt;td&gt;&lt;strong&gt;</w:t>
+      </w:r>
+      <w:proofErr w:type="gramStart"/>
+      <w:r>
+        <w:rPr>
+          <w:rFonts w:ascii="Consolas" w:eastAsia="Times New Roman" w:hAnsi="Consolas" w:cs="Times New Roman"/>
+          <w:color w:val="F6E3CC"/>
+          <w:kern w:val="0"/>
+          <w:sz w:val="21"/>
+          <w:szCs w:val="21"/>
+          <w:lang w:eastAsia="en-ID"/>
+          <w14:ligatures w14:val="none"/>
+        </w:rPr>
+        <w:t>"</w:t>
+      </w:r>
+      <w:r>
+        <w:rPr>
+          <w:rFonts w:ascii="Consolas" w:eastAsia="Times New Roman" w:hAnsi="Consolas" w:cs="Times New Roman"/>
+          <w:color w:val="8D82EA"/>
+          <w:kern w:val="0"/>
+          <w:sz w:val="21"/>
+          <w:szCs w:val="21"/>
+          <w:lang w:eastAsia="en-ID"/>
+          <w14:ligatures w14:val="none"/>
+        </w:rPr>
+        <w:t>.</w:t>
+      </w:r>
+      <w:r>
+        <w:rPr>
+          <w:rFonts w:ascii="Consolas" w:eastAsia="Times New Roman" w:hAnsi="Consolas" w:cs="Times New Roman"/>
+          <w:color w:val="EFA2DA"/>
+          <w:kern w:val="0"/>
+          <w:sz w:val="21"/>
+          <w:szCs w:val="21"/>
+          <w:lang w:eastAsia="en-ID"/>
+          <w14:ligatures w14:val="none"/>
+        </w:rPr>
+        <w:t>htmlspecialchars</w:t>
+      </w:r>
+      <w:proofErr w:type="gramEnd"/>
+      <w:r>
+        <w:rPr>
+          <w:rFonts w:ascii="Consolas" w:eastAsia="Times New Roman" w:hAnsi="Consolas" w:cs="Times New Roman"/>
+          <w:color w:val="EFA2DA"/>
+          <w:kern w:val="0"/>
+          <w:sz w:val="21"/>
+          <w:szCs w:val="21"/>
+          <w:lang w:eastAsia="en-ID"/>
+          <w14:ligatures w14:val="none"/>
+        </w:rPr>
+        <w:t>($_POST[</w:t>
+      </w:r>
+      <w:r>
+        <w:rPr>
+          <w:rFonts w:ascii="Consolas" w:eastAsia="Times New Roman" w:hAnsi="Consolas" w:cs="Times New Roman"/>
+          <w:color w:val="F6E3CC"/>
+          <w:kern w:val="0"/>
+          <w:sz w:val="21"/>
+          <w:szCs w:val="21"/>
+          <w:lang w:eastAsia="en-ID"/>
+          <w14:ligatures w14:val="none"/>
+        </w:rPr>
+        <w:t>"NamaEvent"</w:t>
+      </w:r>
+      <w:r>
+        <w:rPr>
+          <w:rFonts w:ascii="Consolas" w:eastAsia="Times New Roman" w:hAnsi="Consolas" w:cs="Times New Roman"/>
+          <w:color w:val="EFA2DA"/>
+          <w:kern w:val="0"/>
+          <w:sz w:val="21"/>
+          <w:szCs w:val="21"/>
+          <w:lang w:eastAsia="en-ID"/>
+          <w14:ligatures w14:val="none"/>
+        </w:rPr>
+        <w:t>])</w:t>
+      </w:r>
+      <w:r>
+        <w:rPr>
+          <w:rFonts w:ascii="Consolas" w:eastAsia="Times New Roman" w:hAnsi="Consolas" w:cs="Times New Roman"/>
+          <w:color w:val="8D82EA"/>
+          <w:kern w:val="0"/>
+          <w:sz w:val="21"/>
+          <w:szCs w:val="21"/>
+          <w:lang w:eastAsia="en-ID"/>
+          <w14:ligatures w14:val="none"/>
+        </w:rPr>
+        <w:t>.</w:t>
+      </w:r>
+      <w:r>
+        <w:rPr>
+          <w:rFonts w:ascii="Consolas" w:eastAsia="Times New Roman" w:hAnsi="Consolas" w:cs="Times New Roman"/>
+          <w:color w:val="F6E3CC"/>
+          <w:kern w:val="0"/>
+          <w:sz w:val="21"/>
+          <w:szCs w:val="21"/>
+          <w:lang w:eastAsia="en-ID"/>
+          <w14:ligatures w14:val="none"/>
+        </w:rPr>
+        <w:t>"&lt;/strong&gt;&lt;/td&gt;</w:t>
+      </w:r>
+    </w:p>
+    <w:p>
+      <w:pPr>
+        <w:shd w:val="clear" w:color="auto" w:fill="150713"/>
+        <w:spacing w:after="0" w:line="285" w:lineRule="atLeast"/>
+        <w:rPr>
+          <w:rFonts w:ascii="Consolas" w:eastAsia="Times New Roman" w:hAnsi="Consolas" w:cs="Times New Roman"/>
+          <w:color w:val="F8F8F2"/>
+          <w:kern w:val="0"/>
+          <w:sz w:val="21"/>
+          <w:szCs w:val="21"/>
+          <w:lang w:eastAsia="en-ID"/>
+          <w14:ligatures w14:val="none"/>
+        </w:rPr>
+      </w:pPr>
+      <w:r>
+        <w:rPr>
+          <w:rFonts w:ascii="Consolas" w:eastAsia="Times New Roman" w:hAnsi="Consolas" w:cs="Times New Roman"/>
+          <w:color w:val="F6E3CC"/>
+          <w:kern w:val="0"/>
+          <w:sz w:val="21"/>
+          <w:szCs w:val="21"/>
+          <w:lang w:eastAsia="en-ID"/>
+          <w14:ligatures w14:val="none"/>
+        </w:rPr>
+        <w:t>                            &lt;td&gt;&lt;span class='tag {$tag}'&gt;{$</w:t>
+      </w:r>
+      <w:proofErr w:type="gramStart"/>
+      <w:r>
+        <w:rPr>
+          <w:rFonts w:ascii="Consolas" w:eastAsia="Times New Roman" w:hAnsi="Consolas" w:cs="Times New Roman"/>
+          <w:color w:val="F6E3CC"/>
+          <w:kern w:val="0"/>
+          <w:sz w:val="21"/>
+          <w:szCs w:val="21"/>
+          <w:lang w:eastAsia="en-ID"/>
+          <w14:ligatures w14:val="none"/>
+        </w:rPr>
+        <w:t>kat}&lt;</w:t>
+      </w:r>
+      <w:proofErr w:type="gramEnd"/>
+      <w:r>
+        <w:rPr>
+          <w:rFonts w:ascii="Consolas" w:eastAsia="Times New Roman" w:hAnsi="Consolas" w:cs="Times New Roman"/>
+          <w:color w:val="F6E3CC"/>
+          <w:kern w:val="0"/>
+          <w:sz w:val="21"/>
+          <w:szCs w:val="21"/>
+          <w:lang w:eastAsia="en-ID"/>
+          <w14:ligatures w14:val="none"/>
+        </w:rPr>
+        <w:t>/span&gt;&lt;/td&gt;</w:t>
+      </w:r>
+    </w:p>
+    <w:p>
+      <w:pPr>
+        <w:shd w:val="clear" w:color="auto" w:fill="150713"/>
+        <w:spacing w:after="0" w:line="285" w:lineRule="atLeast"/>
+        <w:rPr>
+          <w:rFonts w:ascii="Consolas" w:eastAsia="Times New Roman" w:hAnsi="Consolas" w:cs="Times New Roman"/>
+          <w:color w:val="F8F8F2"/>
+          <w:kern w:val="0"/>
+          <w:sz w:val="21"/>
+          <w:szCs w:val="21"/>
+          <w:lang w:eastAsia="en-ID"/>
+          <w14:ligatures w14:val="none"/>
+        </w:rPr>
+      </w:pPr>
+      <w:r>
+        <w:rPr>
+          <w:rFonts w:ascii="Consolas" w:eastAsia="Times New Roman" w:hAnsi="Consolas" w:cs="Times New Roman"/>
+          <w:color w:val="F6E3CC"/>
+          <w:kern w:val="0"/>
+          <w:sz w:val="21"/>
+          <w:szCs w:val="21"/>
+          <w:lang w:eastAsia="en-ID"/>
+          <w14:ligatures w14:val="none"/>
+        </w:rPr>
+        <w:t>                            &lt;td&gt;</w:t>
+      </w:r>
+      <w:proofErr w:type="gramStart"/>
+      <w:r>
+        <w:rPr>
+          <w:rFonts w:ascii="Consolas" w:eastAsia="Times New Roman" w:hAnsi="Consolas" w:cs="Times New Roman"/>
+          <w:color w:val="F6E3CC"/>
+          <w:kern w:val="0"/>
+          <w:sz w:val="21"/>
+          <w:szCs w:val="21"/>
+          <w:lang w:eastAsia="en-ID"/>
+          <w14:ligatures w14:val="none"/>
+        </w:rPr>
+        <w:t>"</w:t>
+      </w:r>
+      <w:r>
+        <w:rPr>
+          <w:rFonts w:ascii="Consolas" w:eastAsia="Times New Roman" w:hAnsi="Consolas" w:cs="Times New Roman"/>
+          <w:color w:val="8D82EA"/>
+          <w:kern w:val="0"/>
+          <w:sz w:val="21"/>
+          <w:szCs w:val="21"/>
+          <w:lang w:eastAsia="en-ID"/>
+          <w14:ligatures w14:val="none"/>
+        </w:rPr>
+        <w:t>.</w:t>
+      </w:r>
+      <w:proofErr w:type="spellStart"/>
+      <w:r>
+        <w:rPr>
+          <w:rFonts w:ascii="Consolas" w:eastAsia="Times New Roman" w:hAnsi="Consolas" w:cs="Times New Roman"/>
+          <w:color w:val="EFA2DA"/>
+          <w:kern w:val="0"/>
+          <w:sz w:val="21"/>
+          <w:szCs w:val="21"/>
+          <w:lang w:eastAsia="en-ID"/>
+          <w14:ligatures w14:val="none"/>
+        </w:rPr>
+        <w:t>htmlspecialchars</w:t>
+      </w:r>
+      <w:proofErr w:type="spellEnd"/>
+      <w:proofErr w:type="gramEnd"/>
+      <w:r>
+        <w:rPr>
+          <w:rFonts w:ascii="Consolas" w:eastAsia="Times New Roman" w:hAnsi="Consolas" w:cs="Times New Roman"/>
+          <w:color w:val="EFA2DA"/>
+          <w:kern w:val="0"/>
+          <w:sz w:val="21"/>
+          <w:szCs w:val="21"/>
+          <w:lang w:eastAsia="en-ID"/>
+          <w14:ligatures w14:val="none"/>
+        </w:rPr>
+        <w:t>($_POST[</w:t>
+      </w:r>
+      <w:r>
+        <w:rPr>
+          <w:rFonts w:ascii="Consolas" w:eastAsia="Times New Roman" w:hAnsi="Consolas" w:cs="Times New Roman"/>
+          <w:color w:val="F6E3CC"/>
+          <w:kern w:val="0"/>
+          <w:sz w:val="21"/>
+          <w:szCs w:val="21"/>
+          <w:lang w:eastAsia="en-ID"/>
+          <w14:ligatures w14:val="none"/>
+        </w:rPr>
+        <w:t>"Lokasi"</w:t>
+      </w:r>
+      <w:r>
+        <w:rPr>
+          <w:rFonts w:ascii="Consolas" w:eastAsia="Times New Roman" w:hAnsi="Consolas" w:cs="Times New Roman"/>
+          <w:color w:val="EFA2DA"/>
+          <w:kern w:val="0"/>
+          <w:sz w:val="21"/>
+          <w:szCs w:val="21"/>
+          <w:lang w:eastAsia="en-ID"/>
+          <w14:ligatures w14:val="none"/>
+        </w:rPr>
+        <w:t>])</w:t>
+      </w:r>
+      <w:r>
+        <w:rPr>
+          <w:rFonts w:ascii="Consolas" w:eastAsia="Times New Roman" w:hAnsi="Consolas" w:cs="Times New Roman"/>
+          <w:color w:val="8D82EA"/>
+          <w:kern w:val="0"/>
+          <w:sz w:val="21"/>
+          <w:szCs w:val="21"/>
+          <w:lang w:eastAsia="en-ID"/>
+          <w14:ligatures w14:val="none"/>
+        </w:rPr>
+        <w:t>.</w:t>
+      </w:r>
+      <w:r>
+        <w:rPr>
+          <w:rFonts w:ascii="Consolas" w:eastAsia="Times New Roman" w:hAnsi="Consolas" w:cs="Times New Roman"/>
+          <w:color w:val="F6E3CC"/>
+          <w:kern w:val="0"/>
+          <w:sz w:val="21"/>
+          <w:szCs w:val="21"/>
+          <w:lang w:eastAsia="en-ID"/>
+          <w14:ligatures w14:val="none"/>
+        </w:rPr>
+        <w:t>"&lt;/td&gt;</w:t>
+      </w:r>
+    </w:p>
+    <w:p>
+      <w:pPr>
+        <w:shd w:val="clear" w:color="auto" w:fill="150713"/>
+        <w:spacing w:after="0" w:line="285" w:lineRule="atLeast"/>
+        <w:rPr>
+          <w:rFonts w:ascii="Consolas" w:eastAsia="Times New Roman" w:hAnsi="Consolas" w:cs="Times New Roman"/>
+          <w:color w:val="F8F8F2"/>
+          <w:kern w:val="0"/>
+          <w:sz w:val="21"/>
+          <w:szCs w:val="21"/>
+          <w:lang w:eastAsia="en-ID"/>
+          <w14:ligatures w14:val="none"/>
+        </w:rPr>
+      </w:pPr>
+      <w:r>
+        <w:rPr>
+          <w:rFonts w:ascii="Consolas" w:eastAsia="Times New Roman" w:hAnsi="Consolas" w:cs="Times New Roman"/>
+          <w:color w:val="F6E3CC"/>
+          <w:kern w:val="0"/>
+          <w:sz w:val="21"/>
+          <w:szCs w:val="21"/>
+          <w:lang w:eastAsia="en-ID"/>
+          <w14:ligatures w14:val="none"/>
+        </w:rPr>
+        <w:t>                            &lt;td&gt;</w:t>
+      </w:r>
+      <w:proofErr w:type="gramStart"/>
+      <w:r>
+        <w:rPr>
+          <w:rFonts w:ascii="Consolas" w:eastAsia="Times New Roman" w:hAnsi="Consolas" w:cs="Times New Roman"/>
+          <w:color w:val="F6E3CC"/>
+          <w:kern w:val="0"/>
+          <w:sz w:val="21"/>
+          <w:szCs w:val="21"/>
+          <w:lang w:eastAsia="en-ID"/>
+          <w14:ligatures w14:val="none"/>
+        </w:rPr>
+        <w:t>"</w:t>
+      </w:r>
+      <w:r>
+        <w:rPr>
+          <w:rFonts w:ascii="Consolas" w:eastAsia="Times New Roman" w:hAnsi="Consolas" w:cs="Times New Roman"/>
+          <w:color w:val="8D82EA"/>
+          <w:kern w:val="0"/>
+          <w:sz w:val="21"/>
+          <w:szCs w:val="21"/>
+          <w:lang w:eastAsia="en-ID"/>
+          <w14:ligatures w14:val="none"/>
+        </w:rPr>
+        <w:t>.</w:t>
+      </w:r>
+      <w:proofErr w:type="spellStart"/>
+      <w:r>
+        <w:rPr>
+          <w:rFonts w:ascii="Consolas" w:eastAsia="Times New Roman" w:hAnsi="Consolas" w:cs="Times New Roman"/>
+          <w:color w:val="EFA2DA"/>
+          <w:kern w:val="0"/>
+          <w:sz w:val="21"/>
+          <w:szCs w:val="21"/>
+          <w:lang w:eastAsia="en-ID"/>
+          <w14:ligatures w14:val="none"/>
+        </w:rPr>
+        <w:t>htmlspecialchars</w:t>
+      </w:r>
+      <w:proofErr w:type="spellEnd"/>
+      <w:proofErr w:type="gramEnd"/>
+      <w:r>
+        <w:rPr>
+          <w:rFonts w:ascii="Consolas" w:eastAsia="Times New Roman" w:hAnsi="Consolas" w:cs="Times New Roman"/>
+          <w:color w:val="EFA2DA"/>
+          <w:kern w:val="0"/>
+          <w:sz w:val="21"/>
+          <w:szCs w:val="21"/>
+          <w:lang w:eastAsia="en-ID"/>
+          <w14:ligatures w14:val="none"/>
+        </w:rPr>
+        <w:t>($_POST[</w:t>
+      </w:r>
+      <w:r>
+        <w:rPr>
+          <w:rFonts w:ascii="Consolas" w:eastAsia="Times New Roman" w:hAnsi="Consolas" w:cs="Times New Roman"/>
+          <w:color w:val="F6E3CC"/>
+          <w:kern w:val="0"/>
+          <w:sz w:val="21"/>
+          <w:szCs w:val="21"/>
+          <w:lang w:eastAsia="en-ID"/>
+          <w14:ligatures w14:val="none"/>
+        </w:rPr>
+        <w:t>"Detail"</w:t>
+      </w:r>
+      <w:r>
+        <w:rPr>
+          <w:rFonts w:ascii="Consolas" w:eastAsia="Times New Roman" w:hAnsi="Consolas" w:cs="Times New Roman"/>
+          <w:color w:val="EFA2DA"/>
+          <w:kern w:val="0"/>
+          <w:sz w:val="21"/>
+          <w:szCs w:val="21"/>
+          <w:lang w:eastAsia="en-ID"/>
+          <w14:ligatures w14:val="none"/>
+        </w:rPr>
+        <w:t>])</w:t>
+      </w:r>
+      <w:r>
+        <w:rPr>
+          <w:rFonts w:ascii="Consolas" w:eastAsia="Times New Roman" w:hAnsi="Consolas" w:cs="Times New Roman"/>
+          <w:color w:val="8D82EA"/>
+          <w:kern w:val="0"/>
+          <w:sz w:val="21"/>
+          <w:szCs w:val="21"/>
+          <w:lang w:eastAsia="en-ID"/>
+          <w14:ligatures w14:val="none"/>
+        </w:rPr>
+        <w:t>.</w:t>
+      </w:r>
+      <w:r>
+        <w:rPr>
+          <w:rFonts w:ascii="Consolas" w:eastAsia="Times New Roman" w:hAnsi="Consolas" w:cs="Times New Roman"/>
+          <w:color w:val="F6E3CC"/>
+          <w:kern w:val="0"/>
+          <w:sz w:val="21"/>
+          <w:szCs w:val="21"/>
+          <w:lang w:eastAsia="en-ID"/>
+          <w14:ligatures w14:val="none"/>
+        </w:rPr>
+        <w:t>"&lt;/td&gt;</w:t>
+      </w:r>
+    </w:p>
+    <w:p>
+      <w:pPr>
+        <w:shd w:val="clear" w:color="auto" w:fill="150713"/>
+        <w:spacing w:after="0" w:line="285" w:lineRule="atLeast"/>
+        <w:rPr>
+          <w:rFonts w:ascii="Consolas" w:eastAsia="Times New Roman" w:hAnsi="Consolas" w:cs="Times New Roman"/>
+          <w:color w:val="F8F8F2"/>
+          <w:kern w:val="0"/>
+          <w:sz w:val="21"/>
+          <w:szCs w:val="21"/>
+          <w:lang w:eastAsia="en-ID"/>
+          <w14:ligatures w14:val="none"/>
+        </w:rPr>
+      </w:pPr>
+      <w:r>
+        <w:rPr>
+          <w:rFonts w:ascii="Consolas" w:eastAsia="Times New Roman" w:hAnsi="Consolas" w:cs="Times New Roman"/>
+          <w:color w:val="F6E3CC"/>
+          <w:kern w:val="0"/>
+          <w:sz w:val="21"/>
+          <w:szCs w:val="21"/>
+          <w:lang w:eastAsia="en-ID"/>
+          <w14:ligatures w14:val="none"/>
+        </w:rPr>
+        <w:t>                        &lt;/tr&gt;"</w:t>
+      </w:r>
+      <w:r>
+        <w:rPr>
+          <w:rFonts w:ascii="Consolas" w:eastAsia="Times New Roman" w:hAnsi="Consolas" w:cs="Times New Roman"/>
+          <w:color w:val="F8F8F2"/>
+          <w:kern w:val="0"/>
+          <w:sz w:val="21"/>
+          <w:szCs w:val="21"/>
+          <w:lang w:eastAsia="en-ID"/>
+          <w14:ligatures w14:val="none"/>
+        </w:rPr>
+        <w:t>;</w:t>
+      </w:r>
+    </w:p>
+    <w:p>
+      <w:pPr>
+        <w:shd w:val="clear" w:color="auto" w:fill="150713"/>
+        <w:spacing w:after="0" w:line="285" w:lineRule="atLeast"/>
+        <w:rPr>
+          <w:rFonts w:ascii="Consolas" w:eastAsia="Times New Roman" w:hAnsi="Consolas" w:cs="Times New Roman"/>
+          <w:color w:val="F8F8F2"/>
+          <w:kern w:val="0"/>
+          <w:sz w:val="21"/>
+          <w:szCs w:val="21"/>
+          <w:lang w:eastAsia="en-ID"/>
+          <w14:ligatures w14:val="none"/>
+        </w:rPr>
+      </w:pPr>
+      <w:r>
+        <w:rPr>
+          <w:rFonts w:ascii="Consolas" w:eastAsia="Times New Roman" w:hAnsi="Consolas" w:cs="Times New Roman"/>
+          <w:color w:val="F8F8F2"/>
+          <w:kern w:val="0"/>
+          <w:sz w:val="21"/>
+          <w:szCs w:val="21"/>
+          <w:lang w:eastAsia="en-ID"/>
+          <w14:ligatures w14:val="none"/>
+        </w:rPr>
+        <w:t>                }</w:t>
+      </w:r>
+    </w:p>
+    <w:p>
+      <w:pPr>
+        <w:shd w:val="clear" w:color="auto" w:fill="150713"/>
+        <w:spacing w:after="0" w:line="285" w:lineRule="atLeast"/>
+        <w:rPr>
+          <w:rFonts w:ascii="Consolas" w:eastAsia="Times New Roman" w:hAnsi="Consolas" w:cs="Times New Roman"/>
+          <w:color w:val="F8F8F2"/>
+          <w:kern w:val="0"/>
+          <w:sz w:val="21"/>
+          <w:szCs w:val="21"/>
+          <w:lang w:eastAsia="en-ID"/>
+          <w14:ligatures w14:val="none"/>
+        </w:rPr>
+      </w:pPr>
+      <w:r>
+        <w:rPr>
+          <w:rFonts w:ascii="Consolas" w:eastAsia="Times New Roman" w:hAnsi="Consolas" w:cs="Times New Roman"/>
+          <w:color w:val="F8F8F2"/>
+          <w:kern w:val="0"/>
+          <w:sz w:val="21"/>
+          <w:szCs w:val="21"/>
+          <w:lang w:eastAsia="en-ID"/>
+          <w14:ligatures w14:val="none"/>
+        </w:rPr>
+        <w:t>                ?&gt;</w:t>
+      </w:r>
+    </w:p>
+    <w:p>
+      <w:pPr>
+        <w:shd w:val="clear" w:color="auto" w:fill="150713"/>
+        <w:spacing w:after="0" w:line="285" w:lineRule="atLeast"/>
+        <w:rPr>
+          <w:rFonts w:ascii="Consolas" w:eastAsia="Times New Roman" w:hAnsi="Consolas" w:cs="Times New Roman"/>
+          <w:color w:val="F8F8F2"/>
+          <w:kern w:val="0"/>
+          <w:sz w:val="21"/>
+          <w:szCs w:val="21"/>
+          <w:lang w:eastAsia="en-ID"/>
+          <w14:ligatures w14:val="none"/>
+        </w:rPr>
+      </w:pPr>
+      <w:r>
+        <w:rPr>
+          <w:rFonts w:ascii="Consolas" w:eastAsia="Times New Roman" w:hAnsi="Consolas" w:cs="Times New Roman"/>
+          <w:color w:val="F8F8F2"/>
+          <w:kern w:val="0"/>
+          <w:sz w:val="21"/>
+          <w:szCs w:val="21"/>
+          <w:lang w:eastAsia="en-ID"/>
+          <w14:ligatures w14:val="none"/>
+        </w:rPr>
+        <w:t>            &lt;/</w:t>
+      </w:r>
+      <w:proofErr w:type="spellStart"/>
+      <w:r>
+        <w:rPr>
+          <w:rFonts w:ascii="Consolas" w:eastAsia="Times New Roman" w:hAnsi="Consolas" w:cs="Times New Roman"/>
+          <w:color w:val="8D82EA"/>
+          <w:kern w:val="0"/>
+          <w:sz w:val="21"/>
+          <w:szCs w:val="21"/>
+          <w:lang w:eastAsia="en-ID"/>
+          <w14:ligatures w14:val="none"/>
+        </w:rPr>
+        <w:t>tbody</w:t>
+      </w:r>
+      <w:proofErr w:type="spellEnd"/>
+      <w:r>
+        <w:rPr>
+          <w:rFonts w:ascii="Consolas" w:eastAsia="Times New Roman" w:hAnsi="Consolas" w:cs="Times New Roman"/>
+          <w:color w:val="F8F8F2"/>
+          <w:kern w:val="0"/>
+          <w:sz w:val="21"/>
+          <w:szCs w:val="21"/>
+          <w:lang w:eastAsia="en-ID"/>
+          <w14:ligatures w14:val="none"/>
+        </w:rPr>
+        <w:t>&gt;</w:t>
+      </w:r>
+    </w:p>
+    <w:p>
+      <w:pPr>
+        <w:shd w:val="clear" w:color="auto" w:fill="150713"/>
+        <w:spacing w:after="0" w:line="285" w:lineRule="atLeast"/>
+        <w:rPr>
+          <w:rFonts w:ascii="Consolas" w:eastAsia="Times New Roman" w:hAnsi="Consolas" w:cs="Times New Roman"/>
+          <w:color w:val="F8F8F2"/>
+          <w:kern w:val="0"/>
+          <w:sz w:val="21"/>
+          <w:szCs w:val="21"/>
+          <w:lang w:eastAsia="en-ID"/>
+          <w14:ligatures w14:val="none"/>
+        </w:rPr>
+      </w:pPr>
+      <w:r>
+        <w:rPr>
+          <w:rFonts w:ascii="Consolas" w:eastAsia="Times New Roman" w:hAnsi="Consolas" w:cs="Times New Roman"/>
+          <w:color w:val="F8F8F2"/>
+          <w:kern w:val="0"/>
+          <w:sz w:val="21"/>
+          <w:szCs w:val="21"/>
+          <w:lang w:eastAsia="en-ID"/>
+          <w14:ligatures w14:val="none"/>
+        </w:rPr>
+        <w:t>        &lt;/</w:t>
+      </w:r>
+      <w:r>
+        <w:rPr>
+          <w:rFonts w:ascii="Consolas" w:eastAsia="Times New Roman" w:hAnsi="Consolas" w:cs="Times New Roman"/>
+          <w:color w:val="8D82EA"/>
+          <w:kern w:val="0"/>
+          <w:sz w:val="21"/>
+          <w:szCs w:val="21"/>
+          <w:lang w:eastAsia="en-ID"/>
+          <w14:ligatures w14:val="none"/>
+        </w:rPr>
+        <w:t>table</w:t>
+      </w:r>
+      <w:r>
+        <w:rPr>
+          <w:rFonts w:ascii="Consolas" w:eastAsia="Times New Roman" w:hAnsi="Consolas" w:cs="Times New Roman"/>
+          <w:color w:val="F8F8F2"/>
+          <w:kern w:val="0"/>
+          <w:sz w:val="21"/>
+          <w:szCs w:val="21"/>
+          <w:lang w:eastAsia="en-ID"/>
+          <w14:ligatures w14:val="none"/>
+        </w:rPr>
+        <w:t>&gt;</w:t>
+      </w:r>
+    </w:p>
+    <w:p>
+      <w:pPr>
+        <w:shd w:val="clear" w:color="auto" w:fill="150713"/>
+        <w:spacing w:after="0" w:line="285" w:lineRule="atLeast"/>
+        <w:rPr>
+          <w:rFonts w:ascii="Consolas" w:eastAsia="Times New Roman" w:hAnsi="Consolas" w:cs="Times New Roman"/>
+          <w:color w:val="F8F8F2"/>
+          <w:kern w:val="0"/>
+          <w:sz w:val="21"/>
+          <w:szCs w:val="21"/>
+          <w:lang w:eastAsia="en-ID"/>
+          <w14:ligatures w14:val="none"/>
+        </w:rPr>
+      </w:pPr>
+      <w:r>
+        <w:rPr>
+          <w:rFonts w:ascii="Consolas" w:eastAsia="Times New Roman" w:hAnsi="Consolas" w:cs="Times New Roman"/>
+          <w:color w:val="F8F8F2"/>
+          <w:kern w:val="0"/>
+          <w:sz w:val="21"/>
+          <w:szCs w:val="21"/>
+          <w:lang w:eastAsia="en-ID"/>
+          <w14:ligatures w14:val="none"/>
+        </w:rPr>
+        <w:t>        &lt;/</w:t>
+      </w:r>
+      <w:r>
+        <w:rPr>
+          <w:rFonts w:ascii="Consolas" w:eastAsia="Times New Roman" w:hAnsi="Consolas" w:cs="Times New Roman"/>
+          <w:color w:val="8D82EA"/>
+          <w:kern w:val="0"/>
+          <w:sz w:val="21"/>
+          <w:szCs w:val="21"/>
+          <w:lang w:eastAsia="en-ID"/>
+          <w14:ligatures w14:val="none"/>
+        </w:rPr>
+        <w:t>div</w:t>
+      </w:r>
+      <w:r>
+        <w:rPr>
+          <w:rFonts w:ascii="Consolas" w:eastAsia="Times New Roman" w:hAnsi="Consolas" w:cs="Times New Roman"/>
+          <w:color w:val="F8F8F2"/>
+          <w:kern w:val="0"/>
+          <w:sz w:val="21"/>
+          <w:szCs w:val="21"/>
+          <w:lang w:eastAsia="en-ID"/>
+          <w14:ligatures w14:val="none"/>
+        </w:rPr>
+        <w:t>&gt;</w:t>
+      </w:r>
+    </w:p>
+    <w:p>
+      <w:pPr>
+        <w:jc w:val="both"/>
+        <w:rPr>
+          <w:rFonts w:asciiTheme="majorHAnsi" w:hAnsiTheme="majorHAnsi"/>
+          <w:b/>
+          <w:bCs/>
+        </w:rPr>
+      </w:pPr>
+      <w:r>
+        <w:rPr>
+          <w:noProof/>
+        </w:rPr>
+        <w:lastRenderedPageBreak/>
         <w:drawing>
-          <wp:inline distT="0" distB="0" distL="0" distR="0" wp14:anchorId="598D3D00" wp14:editId="495C7BD5">
-            <wp:extent cx="5731510" cy="2994025"/>
-            <wp:effectExtent l="0" t="0" r="2540" b="0"/>
-            <wp:docPr id="906053342" name="Picture 1"/>
+          <wp:inline distT="0" distB="0" distL="0" distR="0" wp14:anchorId="7F0CF522" wp14:editId="666389E4">
+            <wp:extent cx="5731510" cy="1386205"/>
+            <wp:effectExtent l="0" t="0" r="2540" b="4445"/>
+            <wp:docPr id="1397808604" name="Picture 1"/>
             <wp:cNvGraphicFramePr>
               <a:graphicFrameLocks xmlns:a="http://schemas.openxmlformats.org/drawingml/2006/main" noChangeAspect="1"/>
             </wp:cNvGraphicFramePr>
@@ -6026,7 +8774,7 @@
               <a:graphicData uri="http://schemas.openxmlformats.org/drawingml/2006/picture">
                 <pic:pic xmlns:pic="http://schemas.openxmlformats.org/drawingml/2006/picture">
                   <pic:nvPicPr>
-                    <pic:cNvPr id="906053342" name=""/>
+                    <pic:cNvPr id="1397808604" name=""/>
                     <pic:cNvPicPr/>
                   </pic:nvPicPr>
                   <pic:blipFill>
@@ -6038,7 +8786,7 @@
                   <pic:spPr>
                     <a:xfrm>
                       <a:off x="0" y="0"/>
-                      <a:ext cx="5731510" cy="2994025"/>
+                      <a:ext cx="5731510" cy="1386205"/>
                     </a:xfrm>
                     <a:prstGeom prst="rect">
                       <a:avLst/>
@@ -6053,20 +8801,6 @@
     </w:p>
     <w:p>
       <w:pPr>
-        <w:pStyle w:val="ListParagraph"/>
-        <w:ind w:left="1440"/>
-        <w:jc w:val="both"/>
-        <w:rPr>
-          <w:rFonts w:asciiTheme="majorHAnsi" w:hAnsiTheme="majorHAnsi"/>
-          <w:b/>
-          <w:bCs/>
-        </w:rPr>
-      </w:pPr>
-    </w:p>
-    <w:p>
-      <w:pPr>
-        <w:pStyle w:val="ListParagraph"/>
-        <w:ind w:left="1440"/>
         <w:jc w:val="both"/>
         <w:rPr>
           <w:rFonts w:asciiTheme="majorHAnsi" w:hAnsiTheme="majorHAnsi"/>
@@ -7783,7 +10517,6 @@
           <w:lang w:eastAsia="en-ID"/>
           <w14:ligatures w14:val="none"/>
         </w:rPr>
-        <w:lastRenderedPageBreak/>
         <w:t>            &lt;</w:t>
       </w:r>
       <w:r>
@@ -9861,6 +12594,7 @@
         <w:rPr>
           <w:noProof/>
         </w:rPr>
+        <w:lastRenderedPageBreak/>
         <w:drawing>
           <wp:inline distT="0" distB="0" distL="0" distR="0" wp14:anchorId="3C293281" wp14:editId="22FC08BE">
             <wp:extent cx="5731510" cy="2959735"/>
@@ -10605,7 +13339,6 @@
           <w:lang w:eastAsia="en-ID"/>
           <w14:ligatures w14:val="none"/>
         </w:rPr>
-        <w:lastRenderedPageBreak/>
         <w:t xml:space="preserve">    $password </w:t>
       </w:r>
       <w:r>
@@ -11247,6 +13980,42 @@
         </w:rPr>
         <w:t>?&gt;</w:t>
       </w:r>
+    </w:p>
+    <w:p>
+      <w:pPr>
+        <w:pStyle w:val="ListParagraph"/>
+        <w:ind w:left="1440"/>
+        <w:jc w:val="both"/>
+        <w:rPr>
+          <w:rFonts w:asciiTheme="majorHAnsi" w:hAnsiTheme="majorHAnsi"/>
+          <w:b/>
+          <w:bCs/>
+        </w:rPr>
+      </w:pPr>
+    </w:p>
+    <w:p>
+      <w:pPr>
+        <w:pStyle w:val="ListParagraph"/>
+        <w:ind w:left="1440"/>
+        <w:jc w:val="both"/>
+        <w:rPr>
+          <w:rFonts w:asciiTheme="majorHAnsi" w:hAnsiTheme="majorHAnsi"/>
+          <w:b/>
+          <w:bCs/>
+        </w:rPr>
+      </w:pPr>
+    </w:p>
+    <w:p>
+      <w:pPr>
+        <w:pStyle w:val="ListParagraph"/>
+        <w:ind w:left="1440"/>
+        <w:jc w:val="both"/>
+        <w:rPr>
+          <w:rFonts w:asciiTheme="majorHAnsi" w:hAnsiTheme="majorHAnsi"/>
+          <w:b/>
+          <w:bCs/>
+        </w:rPr>
+      </w:pPr>
     </w:p>
     <w:p>
       <w:pPr>
@@ -11293,6 +14062,7 @@
           <w:b/>
           <w:bCs/>
         </w:rPr>
+        <w:lastRenderedPageBreak/>
         <w:t>Analisis</w:t>
       </w:r>
       <w:proofErr w:type="spellEnd"/>
@@ -11635,78 +14405,6 @@
     <w:p>
       <w:pPr>
         <w:pStyle w:val="ListParagraph"/>
-        <w:jc w:val="both"/>
-        <w:rPr>
-          <w:rFonts w:asciiTheme="majorHAnsi" w:hAnsiTheme="majorHAnsi"/>
-          <w:b/>
-          <w:bCs/>
-          <w:lang w:val="sv-SE"/>
-        </w:rPr>
-      </w:pPr>
-    </w:p>
-    <w:p>
-      <w:pPr>
-        <w:pStyle w:val="ListParagraph"/>
-        <w:jc w:val="both"/>
-        <w:rPr>
-          <w:rFonts w:asciiTheme="majorHAnsi" w:hAnsiTheme="majorHAnsi"/>
-          <w:b/>
-          <w:bCs/>
-          <w:lang w:val="sv-SE"/>
-        </w:rPr>
-      </w:pPr>
-    </w:p>
-    <w:p>
-      <w:pPr>
-        <w:pStyle w:val="ListParagraph"/>
-        <w:jc w:val="both"/>
-        <w:rPr>
-          <w:rFonts w:asciiTheme="majorHAnsi" w:hAnsiTheme="majorHAnsi"/>
-          <w:b/>
-          <w:bCs/>
-          <w:lang w:val="sv-SE"/>
-        </w:rPr>
-      </w:pPr>
-    </w:p>
-    <w:p>
-      <w:pPr>
-        <w:pStyle w:val="ListParagraph"/>
-        <w:jc w:val="both"/>
-        <w:rPr>
-          <w:rFonts w:asciiTheme="majorHAnsi" w:hAnsiTheme="majorHAnsi"/>
-          <w:b/>
-          <w:bCs/>
-          <w:lang w:val="sv-SE"/>
-        </w:rPr>
-      </w:pPr>
-    </w:p>
-    <w:p>
-      <w:pPr>
-        <w:pStyle w:val="ListParagraph"/>
-        <w:jc w:val="both"/>
-        <w:rPr>
-          <w:rFonts w:asciiTheme="majorHAnsi" w:hAnsiTheme="majorHAnsi"/>
-          <w:b/>
-          <w:bCs/>
-          <w:lang w:val="sv-SE"/>
-        </w:rPr>
-      </w:pPr>
-    </w:p>
-    <w:p>
-      <w:pPr>
-        <w:pStyle w:val="ListParagraph"/>
-        <w:jc w:val="both"/>
-        <w:rPr>
-          <w:rFonts w:asciiTheme="majorHAnsi" w:hAnsiTheme="majorHAnsi"/>
-          <w:b/>
-          <w:bCs/>
-          <w:lang w:val="sv-SE"/>
-        </w:rPr>
-      </w:pPr>
-    </w:p>
-    <w:p>
-      <w:pPr>
-        <w:pStyle w:val="ListParagraph"/>
         <w:numPr>
           <w:ilvl w:val="0"/>
           <w:numId w:val="11"/>
@@ -11724,7 +14422,6 @@
           <w:b/>
           <w:bCs/>
         </w:rPr>
-        <w:lastRenderedPageBreak/>
         <w:t>Kesimpulan</w:t>
       </w:r>
     </w:p>
@@ -12152,6 +14849,119 @@
     </w:lvl>
   </w:abstractNum>
   <w:abstractNum w:abstractNumId="2" w15:restartNumberingAfterBreak="0">
+    <w:nsid w:val="078A6F66"/>
+    <w:multiLevelType w:val="hybridMultilevel"/>
+    <w:tmpl w:val="C2E41A1C"/>
+    <w:lvl w:ilvl="0" w:tplc="38090001">
+      <w:start w:val="1"/>
+      <w:numFmt w:val="bullet"/>
+      <w:lvlText w:val=""/>
+      <w:lvlJc w:val="left"/>
+      <w:pPr>
+        <w:ind w:left="720" w:hanging="360"/>
+      </w:pPr>
+      <w:rPr>
+        <w:rFonts w:ascii="Symbol" w:hAnsi="Symbol" w:hint="default"/>
+      </w:rPr>
+    </w:lvl>
+    <w:lvl w:ilvl="1" w:tplc="38090003" w:tentative="1">
+      <w:start w:val="1"/>
+      <w:numFmt w:val="bullet"/>
+      <w:lvlText w:val="o"/>
+      <w:lvlJc w:val="left"/>
+      <w:pPr>
+        <w:ind w:left="1440" w:hanging="360"/>
+      </w:pPr>
+      <w:rPr>
+        <w:rFonts w:ascii="Courier New" w:hAnsi="Courier New" w:cs="Courier New" w:hint="default"/>
+      </w:rPr>
+    </w:lvl>
+    <w:lvl w:ilvl="2" w:tplc="38090005" w:tentative="1">
+      <w:start w:val="1"/>
+      <w:numFmt w:val="bullet"/>
+      <w:lvlText w:val=""/>
+      <w:lvlJc w:val="left"/>
+      <w:pPr>
+        <w:ind w:left="2160" w:hanging="360"/>
+      </w:pPr>
+      <w:rPr>
+        <w:rFonts w:ascii="Wingdings" w:hAnsi="Wingdings" w:hint="default"/>
+      </w:rPr>
+    </w:lvl>
+    <w:lvl w:ilvl="3" w:tplc="38090001" w:tentative="1">
+      <w:start w:val="1"/>
+      <w:numFmt w:val="bullet"/>
+      <w:lvlText w:val=""/>
+      <w:lvlJc w:val="left"/>
+      <w:pPr>
+        <w:ind w:left="2880" w:hanging="360"/>
+      </w:pPr>
+      <w:rPr>
+        <w:rFonts w:ascii="Symbol" w:hAnsi="Symbol" w:hint="default"/>
+      </w:rPr>
+    </w:lvl>
+    <w:lvl w:ilvl="4" w:tplc="38090003" w:tentative="1">
+      <w:start w:val="1"/>
+      <w:numFmt w:val="bullet"/>
+      <w:lvlText w:val="o"/>
+      <w:lvlJc w:val="left"/>
+      <w:pPr>
+        <w:ind w:left="3600" w:hanging="360"/>
+      </w:pPr>
+      <w:rPr>
+        <w:rFonts w:ascii="Courier New" w:hAnsi="Courier New" w:cs="Courier New" w:hint="default"/>
+      </w:rPr>
+    </w:lvl>
+    <w:lvl w:ilvl="5" w:tplc="38090005" w:tentative="1">
+      <w:start w:val="1"/>
+      <w:numFmt w:val="bullet"/>
+      <w:lvlText w:val=""/>
+      <w:lvlJc w:val="left"/>
+      <w:pPr>
+        <w:ind w:left="4320" w:hanging="360"/>
+      </w:pPr>
+      <w:rPr>
+        <w:rFonts w:ascii="Wingdings" w:hAnsi="Wingdings" w:hint="default"/>
+      </w:rPr>
+    </w:lvl>
+    <w:lvl w:ilvl="6" w:tplc="38090001" w:tentative="1">
+      <w:start w:val="1"/>
+      <w:numFmt w:val="bullet"/>
+      <w:lvlText w:val=""/>
+      <w:lvlJc w:val="left"/>
+      <w:pPr>
+        <w:ind w:left="5040" w:hanging="360"/>
+      </w:pPr>
+      <w:rPr>
+        <w:rFonts w:ascii="Symbol" w:hAnsi="Symbol" w:hint="default"/>
+      </w:rPr>
+    </w:lvl>
+    <w:lvl w:ilvl="7" w:tplc="38090003" w:tentative="1">
+      <w:start w:val="1"/>
+      <w:numFmt w:val="bullet"/>
+      <w:lvlText w:val="o"/>
+      <w:lvlJc w:val="left"/>
+      <w:pPr>
+        <w:ind w:left="5760" w:hanging="360"/>
+      </w:pPr>
+      <w:rPr>
+        <w:rFonts w:ascii="Courier New" w:hAnsi="Courier New" w:cs="Courier New" w:hint="default"/>
+      </w:rPr>
+    </w:lvl>
+    <w:lvl w:ilvl="8" w:tplc="38090005" w:tentative="1">
+      <w:start w:val="1"/>
+      <w:numFmt w:val="bullet"/>
+      <w:lvlText w:val=""/>
+      <w:lvlJc w:val="left"/>
+      <w:pPr>
+        <w:ind w:left="6480" w:hanging="360"/>
+      </w:pPr>
+      <w:rPr>
+        <w:rFonts w:ascii="Wingdings" w:hAnsi="Wingdings" w:hint="default"/>
+      </w:rPr>
+    </w:lvl>
+  </w:abstractNum>
+  <w:abstractNum w:abstractNumId="3" w15:restartNumberingAfterBreak="0">
     <w:nsid w:val="08B65D11"/>
     <w:multiLevelType w:val="hybridMultilevel"/>
     <w:tmpl w:val="34365402"/>
@@ -12237,10 +15047,10 @@
       </w:pPr>
     </w:lvl>
   </w:abstractNum>
-  <w:abstractNum w:abstractNumId="3" w15:restartNumberingAfterBreak="0">
+  <w:abstractNum w:abstractNumId="4" w15:restartNumberingAfterBreak="0">
     <w:nsid w:val="0FCD5573"/>
     <w:multiLevelType w:val="hybridMultilevel"/>
-    <w:tmpl w:val="B9D8064E"/>
+    <w:tmpl w:val="316A23B6"/>
     <w:lvl w:ilvl="0" w:tplc="38090003">
       <w:start w:val="1"/>
       <w:numFmt w:val="bullet"/>
@@ -12350,7 +15160,7 @@
       </w:rPr>
     </w:lvl>
   </w:abstractNum>
-  <w:abstractNum w:abstractNumId="4" w15:restartNumberingAfterBreak="0">
+  <w:abstractNum w:abstractNumId="5" w15:restartNumberingAfterBreak="0">
     <w:nsid w:val="16CC4A42"/>
     <w:multiLevelType w:val="hybridMultilevel"/>
     <w:tmpl w:val="107A7A88"/>
@@ -12436,7 +15246,7 @@
       </w:pPr>
     </w:lvl>
   </w:abstractNum>
-  <w:abstractNum w:abstractNumId="5" w15:restartNumberingAfterBreak="0">
+  <w:abstractNum w:abstractNumId="6" w15:restartNumberingAfterBreak="0">
     <w:nsid w:val="1CE8254C"/>
     <w:multiLevelType w:val="hybridMultilevel"/>
     <w:tmpl w:val="0CE887FA"/>
@@ -12522,7 +15332,7 @@
       </w:pPr>
     </w:lvl>
   </w:abstractNum>
-  <w:abstractNum w:abstractNumId="6" w15:restartNumberingAfterBreak="0">
+  <w:abstractNum w:abstractNumId="7" w15:restartNumberingAfterBreak="0">
     <w:nsid w:val="38D20CEB"/>
     <w:multiLevelType w:val="multilevel"/>
     <w:tmpl w:val="A5763B80"/>
@@ -12671,7 +15481,7 @@
       </w:rPr>
     </w:lvl>
   </w:abstractNum>
-  <w:abstractNum w:abstractNumId="7" w15:restartNumberingAfterBreak="0">
+  <w:abstractNum w:abstractNumId="8" w15:restartNumberingAfterBreak="0">
     <w:nsid w:val="3F05512A"/>
     <w:multiLevelType w:val="multilevel"/>
     <w:tmpl w:val="102470B6"/>
@@ -12820,7 +15630,7 @@
       </w:rPr>
     </w:lvl>
   </w:abstractNum>
-  <w:abstractNum w:abstractNumId="8" w15:restartNumberingAfterBreak="0">
+  <w:abstractNum w:abstractNumId="9" w15:restartNumberingAfterBreak="0">
     <w:nsid w:val="414E1FBA"/>
     <w:multiLevelType w:val="multilevel"/>
     <w:tmpl w:val="CB2CD14A"/>
@@ -12969,7 +15779,7 @@
       </w:rPr>
     </w:lvl>
   </w:abstractNum>
-  <w:abstractNum w:abstractNumId="9" w15:restartNumberingAfterBreak="0">
+  <w:abstractNum w:abstractNumId="10" w15:restartNumberingAfterBreak="0">
     <w:nsid w:val="4A9E5B5E"/>
     <w:multiLevelType w:val="hybridMultilevel"/>
     <w:tmpl w:val="D0921412"/>
@@ -13082,7 +15892,7 @@
       </w:rPr>
     </w:lvl>
   </w:abstractNum>
-  <w:abstractNum w:abstractNumId="10" w15:restartNumberingAfterBreak="0">
+  <w:abstractNum w:abstractNumId="11" w15:restartNumberingAfterBreak="0">
     <w:nsid w:val="516D1B9E"/>
     <w:multiLevelType w:val="multilevel"/>
     <w:tmpl w:val="5E624D4A"/>
@@ -13231,7 +16041,7 @@
       </w:rPr>
     </w:lvl>
   </w:abstractNum>
-  <w:abstractNum w:abstractNumId="11" w15:restartNumberingAfterBreak="0">
+  <w:abstractNum w:abstractNumId="12" w15:restartNumberingAfterBreak="0">
     <w:nsid w:val="537B4ED7"/>
     <w:multiLevelType w:val="multilevel"/>
     <w:tmpl w:val="ACCCBD86"/>
@@ -13348,7 +16158,7 @@
       </w:pPr>
     </w:lvl>
   </w:abstractNum>
-  <w:abstractNum w:abstractNumId="12" w15:restartNumberingAfterBreak="0">
+  <w:abstractNum w:abstractNumId="13" w15:restartNumberingAfterBreak="0">
     <w:nsid w:val="562D349E"/>
     <w:multiLevelType w:val="multilevel"/>
     <w:tmpl w:val="9EC2E5E8"/>
@@ -13461,7 +16271,7 @@
       </w:rPr>
     </w:lvl>
   </w:abstractNum>
-  <w:abstractNum w:abstractNumId="13" w15:restartNumberingAfterBreak="0">
+  <w:abstractNum w:abstractNumId="14" w15:restartNumberingAfterBreak="0">
     <w:nsid w:val="57DF3C97"/>
     <w:multiLevelType w:val="multilevel"/>
     <w:tmpl w:val="5F70CD2A"/>
@@ -13610,7 +16420,7 @@
       </w:rPr>
     </w:lvl>
   </w:abstractNum>
-  <w:abstractNum w:abstractNumId="14" w15:restartNumberingAfterBreak="0">
+  <w:abstractNum w:abstractNumId="15" w15:restartNumberingAfterBreak="0">
     <w:nsid w:val="6CFC5A30"/>
     <w:multiLevelType w:val="multilevel"/>
     <w:tmpl w:val="50925770"/>
@@ -13759,7 +16569,7 @@
       </w:rPr>
     </w:lvl>
   </w:abstractNum>
-  <w:abstractNum w:abstractNumId="15" w15:restartNumberingAfterBreak="0">
+  <w:abstractNum w:abstractNumId="16" w15:restartNumberingAfterBreak="0">
     <w:nsid w:val="72B13F76"/>
     <w:multiLevelType w:val="multilevel"/>
     <w:tmpl w:val="3086EEB0"/>
@@ -13873,7 +16683,7 @@
     </w:lvl>
   </w:abstractNum>
   <w:num w:numId="1" w16cid:durableId="1212107984">
-    <w:abstractNumId w:val="2"/>
+    <w:abstractNumId w:val="3"/>
     <w:lvlOverride w:ilvl="0">
       <w:startOverride w:val="1"/>
     </w:lvlOverride>
@@ -13903,52 +16713,55 @@
     </w:lvlOverride>
   </w:num>
   <w:num w:numId="2" w16cid:durableId="2037731966">
-    <w:abstractNumId w:val="6"/>
+    <w:abstractNumId w:val="7"/>
   </w:num>
   <w:num w:numId="3" w16cid:durableId="850875757">
-    <w:abstractNumId w:val="13"/>
+    <w:abstractNumId w:val="14"/>
   </w:num>
   <w:num w:numId="4" w16cid:durableId="1786728240">
+    <w:abstractNumId w:val="11"/>
+  </w:num>
+  <w:num w:numId="5" w16cid:durableId="647634894">
     <w:abstractNumId w:val="10"/>
   </w:num>
-  <w:num w:numId="5" w16cid:durableId="647634894">
-    <w:abstractNumId w:val="9"/>
-  </w:num>
   <w:num w:numId="6" w16cid:durableId="1501695808">
-    <w:abstractNumId w:val="12"/>
+    <w:abstractNumId w:val="13"/>
   </w:num>
   <w:num w:numId="7" w16cid:durableId="1616868197">
     <w:abstractNumId w:val="1"/>
   </w:num>
   <w:num w:numId="8" w16cid:durableId="1320041325">
-    <w:abstractNumId w:val="8"/>
+    <w:abstractNumId w:val="9"/>
   </w:num>
   <w:num w:numId="9" w16cid:durableId="144662246">
-    <w:abstractNumId w:val="2"/>
+    <w:abstractNumId w:val="3"/>
   </w:num>
   <w:num w:numId="10" w16cid:durableId="1327318453">
-    <w:abstractNumId w:val="15"/>
+    <w:abstractNumId w:val="16"/>
   </w:num>
   <w:num w:numId="11" w16cid:durableId="167721060">
-    <w:abstractNumId w:val="5"/>
+    <w:abstractNumId w:val="6"/>
   </w:num>
   <w:num w:numId="12" w16cid:durableId="282154903">
     <w:abstractNumId w:val="0"/>
   </w:num>
   <w:num w:numId="13" w16cid:durableId="1040976983">
+    <w:abstractNumId w:val="5"/>
+  </w:num>
+  <w:num w:numId="14" w16cid:durableId="229315158">
     <w:abstractNumId w:val="4"/>
   </w:num>
-  <w:num w:numId="14" w16cid:durableId="229315158">
-    <w:abstractNumId w:val="3"/>
-  </w:num>
   <w:num w:numId="15" w16cid:durableId="721908373">
-    <w:abstractNumId w:val="11"/>
+    <w:abstractNumId w:val="12"/>
   </w:num>
   <w:num w:numId="16" w16cid:durableId="1236208389">
-    <w:abstractNumId w:val="7"/>
+    <w:abstractNumId w:val="8"/>
   </w:num>
   <w:num w:numId="17" w16cid:durableId="1854102960">
-    <w:abstractNumId w:val="14"/>
+    <w:abstractNumId w:val="15"/>
+  </w:num>
+  <w:num w:numId="18" w16cid:durableId="1909339089">
+    <w:abstractNumId w:val="2"/>
   </w:num>
 </w:numbering>
 </file>

</xml_diff>